<commit_message>
docs: updated CV, changed Placeholders
</commit_message>
<xml_diff>
--- a/public/CV_Virginia Celine Oei.docx
+++ b/public/CV_Virginia Celine Oei.docx
@@ -198,6 +198,7 @@
           <w:szCs w:val="20"/>
         </w:rPr>
       </w:pPr>
+      <w:bookmarkStart w:id="0" w:name="_GoBack"/>
       <w:r>
         <w:rPr>
           <w:b/>
@@ -208,6 +209,7 @@
         <w:t>About Me</w:t>
       </w:r>
     </w:p>
+    <w:bookmarkEnd w:id="0"/>
     <w:p>
       <w:pPr>
         <w:tabs>
@@ -833,8 +835,8 @@
           <w:szCs w:val="20"/>
         </w:rPr>
       </w:pPr>
-      <w:bookmarkStart w:id="0" w:name="_gjdgxs" w:colFirst="0" w:colLast="0"/>
-      <w:bookmarkEnd w:id="0"/>
+      <w:bookmarkStart w:id="1" w:name="_gjdgxs" w:colFirst="0" w:colLast="0"/>
+      <w:bookmarkEnd w:id="1"/>
     </w:p>
     <w:p>
       <w:pPr>
@@ -1114,8 +1116,6 @@
           <w:szCs w:val="20"/>
         </w:rPr>
       </w:pPr>
-      <w:bookmarkStart w:id="1" w:name="_GoBack"/>
-      <w:bookmarkEnd w:id="1"/>
     </w:p>
     <w:p>
       <w:pPr>
@@ -1798,7 +1798,25 @@
           <w:sz w:val="18"/>
           <w:szCs w:val="20"/>
         </w:rPr>
-        <w:t xml:space="preserve">Frontend Frameworks: </w:t>
+        <w:t>Frontend Frameworks</w:t>
+      </w:r>
+      <w:r>
+        <w:rPr>
+          <w:b/>
+          <w:bCs/>
+          <w:sz w:val="18"/>
+          <w:szCs w:val="20"/>
+        </w:rPr>
+        <w:t>/Tool</w:t>
+      </w:r>
+      <w:r>
+        <w:rPr>
+          <w:b/>
+          <w:bCs/>
+          <w:sz w:val="18"/>
+          <w:szCs w:val="20"/>
+        </w:rPr>
+        <w:t xml:space="preserve">: </w:t>
       </w:r>
       <w:r>
         <w:rPr>
@@ -1808,6 +1826,24 @@
         </w:rPr>
         <w:t>React, Next.js</w:t>
       </w:r>
+      <w:r>
+        <w:rPr>
+          <w:bCs/>
+          <w:sz w:val="18"/>
+          <w:szCs w:val="20"/>
+        </w:rPr>
+        <w:t xml:space="preserve">, </w:t>
+      </w:r>
+      <w:proofErr w:type="spellStart"/>
+      <w:r>
+        <w:rPr>
+          <w:bCs/>
+          <w:sz w:val="18"/>
+          <w:szCs w:val="20"/>
+        </w:rPr>
+        <w:t>Vite</w:t>
+      </w:r>
+      <w:proofErr w:type="spellEnd"/>
     </w:p>
     <w:p>
       <w:pPr>
@@ -3051,6 +3087,7 @@
   <w:style w:type="character" w:default="1" w:styleId="DefaultParagraphFont">
     <w:name w:val="Default Paragraph Font"/>
     <w:uiPriority w:val="1"/>
+    <w:semiHidden/>
     <w:unhideWhenUsed/>
   </w:style>
   <w:style w:type="table" w:default="1" w:styleId="TableNormal">
@@ -3436,6 +3473,7 @@
   <w:style w:type="character" w:default="1" w:styleId="DefaultParagraphFont">
     <w:name w:val="Default Paragraph Font"/>
     <w:uiPriority w:val="1"/>
+    <w:semiHidden/>
     <w:unhideWhenUsed/>
   </w:style>
   <w:style w:type="table" w:default="1" w:styleId="TableNormal">

</xml_diff>

<commit_message>
style: removed pulse on Home and blur on About
</commit_message>
<xml_diff>
--- a/public/CV_Virginia Celine Oei.docx
+++ b/public/CV_Virginia Celine Oei.docx
@@ -111,18 +111,37 @@
         </w:rPr>
         <w:t xml:space="preserve"> | </w:t>
       </w:r>
-      <w:hyperlink r:id="rId7" w:history="1">
-        <w:r>
-          <w:rPr>
-            <w:rStyle w:val="Hyperlink"/>
-            <w:b/>
-            <w:bCs/>
-            <w:sz w:val="18"/>
-            <w:szCs w:val="20"/>
-          </w:rPr>
-          <w:t>Portfolio</w:t>
-        </w:r>
-      </w:hyperlink>
+      <w:bookmarkStart w:id="0" w:name="_GoBack"/>
+      <w:bookmarkEnd w:id="0"/>
+      <w:r>
+        <w:fldChar w:fldCharType="begin"/>
+      </w:r>
+      <w:r>
+        <w:instrText>HYPERLINK "https://my-portfolio-celine44.vercel.app"</w:instrText>
+      </w:r>
+      <w:r>
+        <w:fldChar w:fldCharType="separate"/>
+      </w:r>
+      <w:r>
+        <w:rPr>
+          <w:rStyle w:val="Hyperlink"/>
+          <w:b/>
+          <w:bCs/>
+          <w:sz w:val="18"/>
+          <w:szCs w:val="20"/>
+        </w:rPr>
+        <w:t>Portfolio</w:t>
+      </w:r>
+      <w:r>
+        <w:rPr>
+          <w:rStyle w:val="Hyperlink"/>
+          <w:b/>
+          <w:bCs/>
+          <w:sz w:val="18"/>
+          <w:szCs w:val="20"/>
+        </w:rPr>
+        <w:fldChar w:fldCharType="end"/>
+      </w:r>
       <w:r>
         <w:rPr>
           <w:b/>
@@ -198,7 +217,6 @@
           <w:szCs w:val="20"/>
         </w:rPr>
       </w:pPr>
-      <w:bookmarkStart w:id="0" w:name="_GoBack"/>
       <w:r>
         <w:rPr>
           <w:b/>
@@ -209,7 +227,6 @@
         <w:t>About Me</w:t>
       </w:r>
     </w:p>
-    <w:bookmarkEnd w:id="0"/>
     <w:p>
       <w:pPr>
         <w:tabs>
@@ -621,7 +638,7 @@
         </w:rPr>
         <w:t xml:space="preserve"> </w:t>
       </w:r>
-      <w:hyperlink r:id="rId8" w:history="1">
+      <w:hyperlink r:id="rId7" w:history="1">
         <w:r>
           <w:rPr>
             <w:rStyle w:val="Hyperlink"/>
@@ -655,7 +672,7 @@
         </w:rPr>
         <w:t xml:space="preserve">Link to backend: </w:t>
       </w:r>
-      <w:hyperlink r:id="rId9" w:history="1">
+      <w:hyperlink r:id="rId8" w:history="1">
         <w:r>
           <w:rPr>
             <w:rStyle w:val="Hyperlink"/>
@@ -886,7 +903,27 @@
           <w:sz w:val="18"/>
           <w:szCs w:val="20"/>
         </w:rPr>
-        <w:t xml:space="preserve">Product Requirement Document Implementation </w:t>
+        <w:t xml:space="preserve">E-Commerce </w:t>
+      </w:r>
+      <w:proofErr w:type="spellStart"/>
+      <w:r>
+        <w:rPr>
+          <w:b/>
+          <w:bCs/>
+          <w:sz w:val="18"/>
+          <w:szCs w:val="20"/>
+        </w:rPr>
+        <w:t>MamaBear</w:t>
+      </w:r>
+      <w:proofErr w:type="spellEnd"/>
+      <w:r>
+        <w:rPr>
+          <w:b/>
+          <w:bCs/>
+          <w:sz w:val="18"/>
+          <w:szCs w:val="20"/>
+        </w:rPr>
+        <w:t xml:space="preserve"> </w:t>
       </w:r>
       <w:proofErr w:type="gramStart"/>
       <w:r>
@@ -905,19 +942,8 @@
           <w:sz w:val="18"/>
           <w:szCs w:val="20"/>
         </w:rPr>
-        <w:t xml:space="preserve"> </w:t>
-      </w:r>
-      <w:proofErr w:type="spellStart"/>
-      <w:r>
-        <w:rPr>
-          <w:b/>
-          <w:bCs/>
-          <w:sz w:val="18"/>
-          <w:szCs w:val="20"/>
-        </w:rPr>
-        <w:t>WeRent</w:t>
-      </w:r>
-      <w:proofErr w:type="spellEnd"/>
+        <w:t xml:space="preserve"> Virtual</w:t>
+      </w:r>
       <w:proofErr w:type="gramEnd"/>
       <w:r>
         <w:rPr>
@@ -926,8 +952,39 @@
           <w:sz w:val="18"/>
           <w:szCs w:val="20"/>
         </w:rPr>
-        <w:t xml:space="preserve"> / Frontend Developer</w:t>
-      </w:r>
+        <w:t xml:space="preserve"> Internship </w:t>
+      </w:r>
+      <w:proofErr w:type="spellStart"/>
+      <w:r>
+        <w:rPr>
+          <w:b/>
+          <w:bCs/>
+          <w:sz w:val="18"/>
+          <w:szCs w:val="20"/>
+        </w:rPr>
+        <w:t>RevoU</w:t>
+      </w:r>
+      <w:proofErr w:type="spellEnd"/>
+      <w:r>
+        <w:rPr>
+          <w:b/>
+          <w:bCs/>
+          <w:sz w:val="18"/>
+          <w:szCs w:val="20"/>
+        </w:rPr>
+        <w:t xml:space="preserve"> X </w:t>
+      </w:r>
+      <w:proofErr w:type="spellStart"/>
+      <w:r>
+        <w:rPr>
+          <w:b/>
+          <w:bCs/>
+          <w:sz w:val="18"/>
+          <w:szCs w:val="20"/>
+        </w:rPr>
+        <w:t>MamaBear</w:t>
+      </w:r>
+      <w:proofErr w:type="spellEnd"/>
       <w:r>
         <w:rPr>
           <w:b/>
@@ -936,16 +993,25 @@
           <w:szCs w:val="20"/>
         </w:rPr>
         <w:tab/>
-      </w:r>
-      <w:r>
-        <w:rPr>
-          <w:b/>
-          <w:bCs/>
-          <w:sz w:val="18"/>
-          <w:szCs w:val="20"/>
-        </w:rPr>
-        <w:tab/>
-        <w:t>Apr 2026</w:t>
+        <w:t xml:space="preserve">May 2026 </w:t>
+      </w:r>
+      <w:r>
+        <w:rPr>
+          <w:b/>
+          <w:bCs/>
+          <w:sz w:val="18"/>
+          <w:szCs w:val="20"/>
+        </w:rPr>
+        <w:t>–</w:t>
+      </w:r>
+      <w:r>
+        <w:rPr>
+          <w:b/>
+          <w:bCs/>
+          <w:sz w:val="18"/>
+          <w:szCs w:val="20"/>
+        </w:rPr>
+        <w:t xml:space="preserve"> June 2026</w:t>
       </w:r>
     </w:p>
     <w:p>
@@ -970,133 +1036,25 @@
           <w:sz w:val="18"/>
           <w:szCs w:val="20"/>
         </w:rPr>
-        <w:t xml:space="preserve">I was responsible for developing key features on the </w:t>
-      </w:r>
-      <w:proofErr w:type="spellStart"/>
-      <w:r>
-        <w:rPr>
-          <w:bCs/>
-          <w:sz w:val="18"/>
-          <w:szCs w:val="20"/>
-        </w:rPr>
-        <w:t>WeRent</w:t>
-      </w:r>
-      <w:proofErr w:type="spellEnd"/>
-      <w:r>
-        <w:rPr>
-          <w:bCs/>
-          <w:sz w:val="18"/>
-          <w:szCs w:val="20"/>
-        </w:rPr>
-        <w:t xml:space="preserve"> platform, including the </w:t>
-      </w:r>
-      <w:proofErr w:type="spellStart"/>
-      <w:r>
-        <w:rPr>
-          <w:bCs/>
-          <w:sz w:val="18"/>
-          <w:szCs w:val="20"/>
-        </w:rPr>
-        <w:t>CartPage</w:t>
-      </w:r>
-      <w:proofErr w:type="spellEnd"/>
-      <w:r>
-        <w:rPr>
-          <w:bCs/>
-          <w:sz w:val="18"/>
-          <w:szCs w:val="20"/>
-        </w:rPr>
-        <w:t xml:space="preserve"> and </w:t>
-      </w:r>
-      <w:proofErr w:type="spellStart"/>
-      <w:r>
-        <w:rPr>
-          <w:bCs/>
-          <w:sz w:val="18"/>
-          <w:szCs w:val="20"/>
-        </w:rPr>
-        <w:t>ShipmentPage</w:t>
-      </w:r>
-      <w:proofErr w:type="spellEnd"/>
-      <w:r>
-        <w:rPr>
-          <w:bCs/>
-          <w:sz w:val="18"/>
-          <w:szCs w:val="20"/>
-        </w:rPr>
-        <w:t xml:space="preserve">, utilizing React and </w:t>
-      </w:r>
-      <w:proofErr w:type="spellStart"/>
-      <w:r>
-        <w:rPr>
-          <w:bCs/>
-          <w:sz w:val="18"/>
-          <w:szCs w:val="20"/>
-        </w:rPr>
-        <w:t>TypeScript</w:t>
-      </w:r>
-      <w:proofErr w:type="spellEnd"/>
-      <w:r>
-        <w:rPr>
-          <w:bCs/>
-          <w:sz w:val="18"/>
-          <w:szCs w:val="20"/>
-        </w:rPr>
-        <w:t xml:space="preserve"> while implementing JWT authentication to ensure secure transactions. I effectively implemented the </w:t>
-      </w:r>
-      <w:proofErr w:type="spellStart"/>
-      <w:r>
-        <w:rPr>
-          <w:bCs/>
-          <w:sz w:val="18"/>
-          <w:szCs w:val="20"/>
-        </w:rPr>
-        <w:t>PaymentPage</w:t>
-      </w:r>
-      <w:proofErr w:type="spellEnd"/>
-      <w:r>
-        <w:rPr>
-          <w:bCs/>
-          <w:sz w:val="18"/>
-          <w:szCs w:val="20"/>
-        </w:rPr>
-        <w:t xml:space="preserve">, focusing on creating a responsive design using Tailwind CSS to enhance user experience during the checkout process. Additionally, I designed the </w:t>
-      </w:r>
-      <w:proofErr w:type="spellStart"/>
-      <w:r>
-        <w:rPr>
-          <w:bCs/>
-          <w:sz w:val="18"/>
-          <w:szCs w:val="20"/>
-        </w:rPr>
-        <w:t>OrdersPage</w:t>
-      </w:r>
-      <w:proofErr w:type="spellEnd"/>
-      <w:r>
-        <w:rPr>
-          <w:bCs/>
-          <w:sz w:val="18"/>
-          <w:szCs w:val="20"/>
-        </w:rPr>
-        <w:t xml:space="preserve"> and </w:t>
-      </w:r>
-      <w:proofErr w:type="spellStart"/>
-      <w:r>
-        <w:rPr>
-          <w:bCs/>
-          <w:sz w:val="18"/>
-          <w:szCs w:val="20"/>
-        </w:rPr>
-        <w:t>OrderDetail</w:t>
-      </w:r>
-      <w:proofErr w:type="spellEnd"/>
-      <w:r>
-        <w:rPr>
-          <w:bCs/>
-          <w:sz w:val="18"/>
-          <w:szCs w:val="20"/>
-        </w:rPr>
-        <w:t xml:space="preserve"> to create intuitive layouts that improved user navigation through order management features.</w:t>
+        <w:t xml:space="preserve">I developed an e-commerce website for </w:t>
+      </w:r>
+      <w:proofErr w:type="spellStart"/>
+      <w:r>
+        <w:rPr>
+          <w:bCs/>
+          <w:sz w:val="18"/>
+          <w:szCs w:val="20"/>
+        </w:rPr>
+        <w:t>MamaBear</w:t>
+      </w:r>
+      <w:proofErr w:type="spellEnd"/>
+      <w:r>
+        <w:rPr>
+          <w:bCs/>
+          <w:sz w:val="18"/>
+          <w:szCs w:val="20"/>
+        </w:rPr>
+        <w:t>, a brand focused on products for pregnant and nursing mothers, utilizing React and Next.js to enhance front-end responsiveness. I implemented Sign-Up and Log-In authentication pages, which significantly improved user access and security through the integration of robust protocols with Nest.js. Additionally, I created a comprehensive product catalog showcasing a diverse range of items, leading to a noticeable enhancement in user engagement by employing user-centered design principles. Furthermore, I collaborated with back-end developers to integrate APIs for data retrieval, contributing to the project’s timely completion through effective communication tools.</w:t>
       </w:r>
     </w:p>
     <w:p>
@@ -1134,6 +1092,261 @@
           <w:szCs w:val="20"/>
         </w:rPr>
       </w:pPr>
+      <w:r>
+        <w:rPr>
+          <w:b/>
+          <w:bCs/>
+          <w:sz w:val="18"/>
+          <w:szCs w:val="20"/>
+        </w:rPr>
+        <w:t xml:space="preserve">Product Requirement Document Implementation </w:t>
+      </w:r>
+      <w:proofErr w:type="gramStart"/>
+      <w:r>
+        <w:rPr>
+          <w:b/>
+          <w:bCs/>
+          <w:sz w:val="18"/>
+          <w:szCs w:val="20"/>
+        </w:rPr>
+        <w:t xml:space="preserve">– </w:t>
+      </w:r>
+      <w:r>
+        <w:rPr>
+          <w:b/>
+          <w:bCs/>
+          <w:sz w:val="18"/>
+          <w:szCs w:val="20"/>
+        </w:rPr>
+        <w:t xml:space="preserve"> </w:t>
+      </w:r>
+      <w:proofErr w:type="spellStart"/>
+      <w:r>
+        <w:rPr>
+          <w:b/>
+          <w:bCs/>
+          <w:sz w:val="18"/>
+          <w:szCs w:val="20"/>
+        </w:rPr>
+        <w:t>WeRent</w:t>
+      </w:r>
+      <w:proofErr w:type="spellEnd"/>
+      <w:proofErr w:type="gramEnd"/>
+      <w:r>
+        <w:rPr>
+          <w:b/>
+          <w:bCs/>
+          <w:sz w:val="18"/>
+          <w:szCs w:val="20"/>
+        </w:rPr>
+        <w:t xml:space="preserve"> / Frontend Developer</w:t>
+      </w:r>
+      <w:r>
+        <w:rPr>
+          <w:b/>
+          <w:bCs/>
+          <w:sz w:val="18"/>
+          <w:szCs w:val="20"/>
+        </w:rPr>
+        <w:tab/>
+      </w:r>
+      <w:r>
+        <w:rPr>
+          <w:b/>
+          <w:bCs/>
+          <w:sz w:val="18"/>
+          <w:szCs w:val="20"/>
+        </w:rPr>
+        <w:tab/>
+        <w:t>Apr 2026</w:t>
+      </w:r>
+    </w:p>
+    <w:p>
+      <w:pPr>
+        <w:tabs>
+          <w:tab w:val="left" w:pos="8222"/>
+          <w:tab w:val="left" w:pos="9356"/>
+          <w:tab w:val="right" w:pos="10206"/>
+        </w:tabs>
+        <w:spacing w:before="60" w:line="240" w:lineRule="auto"/>
+        <w:ind w:left="-851" w:right="-846"/>
+        <w:jc w:val="both"/>
+        <w:rPr>
+          <w:bCs/>
+          <w:sz w:val="18"/>
+          <w:szCs w:val="20"/>
+        </w:rPr>
+      </w:pPr>
+      <w:r>
+        <w:rPr>
+          <w:bCs/>
+          <w:sz w:val="18"/>
+          <w:szCs w:val="20"/>
+        </w:rPr>
+        <w:t xml:space="preserve">I was responsible for developing key features on the </w:t>
+      </w:r>
+      <w:proofErr w:type="spellStart"/>
+      <w:r>
+        <w:rPr>
+          <w:bCs/>
+          <w:sz w:val="18"/>
+          <w:szCs w:val="20"/>
+        </w:rPr>
+        <w:t>WeRent</w:t>
+      </w:r>
+      <w:proofErr w:type="spellEnd"/>
+      <w:r>
+        <w:rPr>
+          <w:bCs/>
+          <w:sz w:val="18"/>
+          <w:szCs w:val="20"/>
+        </w:rPr>
+        <w:t xml:space="preserve"> platform, including the </w:t>
+      </w:r>
+      <w:proofErr w:type="spellStart"/>
+      <w:r>
+        <w:rPr>
+          <w:bCs/>
+          <w:sz w:val="18"/>
+          <w:szCs w:val="20"/>
+        </w:rPr>
+        <w:t>CartPage</w:t>
+      </w:r>
+      <w:proofErr w:type="spellEnd"/>
+      <w:r>
+        <w:rPr>
+          <w:bCs/>
+          <w:sz w:val="18"/>
+          <w:szCs w:val="20"/>
+        </w:rPr>
+        <w:t xml:space="preserve"> and </w:t>
+      </w:r>
+      <w:proofErr w:type="spellStart"/>
+      <w:r>
+        <w:rPr>
+          <w:bCs/>
+          <w:sz w:val="18"/>
+          <w:szCs w:val="20"/>
+        </w:rPr>
+        <w:t>ShipmentPage</w:t>
+      </w:r>
+      <w:proofErr w:type="spellEnd"/>
+      <w:r>
+        <w:rPr>
+          <w:bCs/>
+          <w:sz w:val="18"/>
+          <w:szCs w:val="20"/>
+        </w:rPr>
+        <w:t xml:space="preserve">, utilizing React and </w:t>
+      </w:r>
+      <w:proofErr w:type="spellStart"/>
+      <w:r>
+        <w:rPr>
+          <w:bCs/>
+          <w:sz w:val="18"/>
+          <w:szCs w:val="20"/>
+        </w:rPr>
+        <w:t>TypeScript</w:t>
+      </w:r>
+      <w:proofErr w:type="spellEnd"/>
+      <w:r>
+        <w:rPr>
+          <w:bCs/>
+          <w:sz w:val="18"/>
+          <w:szCs w:val="20"/>
+        </w:rPr>
+        <w:t xml:space="preserve"> while implementing JWT authentication to ensure secure transactions. I effectively implemented the </w:t>
+      </w:r>
+      <w:proofErr w:type="spellStart"/>
+      <w:r>
+        <w:rPr>
+          <w:bCs/>
+          <w:sz w:val="18"/>
+          <w:szCs w:val="20"/>
+        </w:rPr>
+        <w:t>PaymentPage</w:t>
+      </w:r>
+      <w:proofErr w:type="spellEnd"/>
+      <w:r>
+        <w:rPr>
+          <w:bCs/>
+          <w:sz w:val="18"/>
+          <w:szCs w:val="20"/>
+        </w:rPr>
+        <w:t xml:space="preserve">, focusing on creating a responsive design using Tailwind CSS to enhance user experience during the checkout process. Additionally, I designed the </w:t>
+      </w:r>
+      <w:proofErr w:type="spellStart"/>
+      <w:r>
+        <w:rPr>
+          <w:bCs/>
+          <w:sz w:val="18"/>
+          <w:szCs w:val="20"/>
+        </w:rPr>
+        <w:t>OrdersPage</w:t>
+      </w:r>
+      <w:proofErr w:type="spellEnd"/>
+      <w:r>
+        <w:rPr>
+          <w:bCs/>
+          <w:sz w:val="18"/>
+          <w:szCs w:val="20"/>
+        </w:rPr>
+        <w:t xml:space="preserve"> and </w:t>
+      </w:r>
+      <w:proofErr w:type="spellStart"/>
+      <w:r>
+        <w:rPr>
+          <w:bCs/>
+          <w:sz w:val="18"/>
+          <w:szCs w:val="20"/>
+        </w:rPr>
+        <w:t>OrderDetail</w:t>
+      </w:r>
+      <w:proofErr w:type="spellEnd"/>
+      <w:r>
+        <w:rPr>
+          <w:bCs/>
+          <w:sz w:val="18"/>
+          <w:szCs w:val="20"/>
+        </w:rPr>
+        <w:t xml:space="preserve"> to create intuitive layouts that improved user navigation through order management features.</w:t>
+      </w:r>
+    </w:p>
+    <w:p>
+      <w:pPr>
+        <w:tabs>
+          <w:tab w:val="left" w:pos="8222"/>
+          <w:tab w:val="left" w:pos="9356"/>
+          <w:tab w:val="right" w:pos="10206"/>
+        </w:tabs>
+        <w:spacing w:before="60" w:line="240" w:lineRule="auto"/>
+        <w:ind w:left="-851" w:right="-846"/>
+        <w:jc w:val="both"/>
+        <w:rPr>
+          <w:b/>
+          <w:bCs/>
+          <w:sz w:val="18"/>
+          <w:szCs w:val="20"/>
+        </w:rPr>
+      </w:pPr>
+    </w:p>
+    <w:p>
+      <w:pPr>
+        <w:tabs>
+          <w:tab w:val="left" w:pos="8222"/>
+          <w:tab w:val="left" w:pos="9356"/>
+          <w:tab w:val="right" w:pos="10206"/>
+        </w:tabs>
+        <w:spacing w:before="60" w:line="240" w:lineRule="auto"/>
+        <w:ind w:left="-851" w:right="-846"/>
+        <w:jc w:val="both"/>
+        <w:rPr>
+          <w:b/>
+          <w:bCs/>
+          <w:sz w:val="18"/>
+          <w:szCs w:val="20"/>
+        </w:rPr>
+      </w:pPr>
       <w:proofErr w:type="spellStart"/>
       <w:r>
         <w:rPr>
@@ -1218,56 +1431,65 @@
         <w:ind w:left="-851" w:right="-897"/>
         <w:jc w:val="both"/>
         <w:rPr>
+          <w:sz w:val="18"/>
+          <w:szCs w:val="20"/>
+        </w:rPr>
+      </w:pPr>
+      <w:r>
+        <w:rPr>
           <w:iCs/>
           <w:sz w:val="18"/>
           <w:szCs w:val="20"/>
         </w:rPr>
-      </w:pPr>
-      <w:r>
-        <w:rPr>
+        <w:t xml:space="preserve">I architected and developed a comprehensive end-to-end movie ticketing platform, integrating a high-performance </w:t>
+      </w:r>
+      <w:r>
+        <w:rPr>
+          <w:bCs/>
           <w:iCs/>
           <w:sz w:val="18"/>
           <w:szCs w:val="20"/>
         </w:rPr>
-        <w:t xml:space="preserve">I architected and developed a comprehensive end-to-end movie ticketing platform, integrating a high-performance </w:t>
-      </w:r>
-      <w:r>
-        <w:rPr>
-          <w:bCs/>
+        <w:t>Next.js</w:t>
+      </w:r>
+      <w:r>
+        <w:rPr>
           <w:iCs/>
           <w:sz w:val="18"/>
           <w:szCs w:val="20"/>
         </w:rPr>
-        <w:t>Next.js</w:t>
-      </w:r>
-      <w:r>
-        <w:rPr>
+        <w:t xml:space="preserve"> frontend with a modular </w:t>
+      </w:r>
+      <w:proofErr w:type="spellStart"/>
+      <w:r>
+        <w:rPr>
+          <w:bCs/>
           <w:iCs/>
           <w:sz w:val="18"/>
           <w:szCs w:val="20"/>
         </w:rPr>
-        <w:t xml:space="preserve"> frontend with a modular </w:t>
-      </w:r>
-      <w:proofErr w:type="spellStart"/>
-      <w:r>
-        <w:rPr>
-          <w:bCs/>
+        <w:t>NestJS</w:t>
+      </w:r>
+      <w:proofErr w:type="spellEnd"/>
+      <w:r>
+        <w:rPr>
           <w:iCs/>
           <w:sz w:val="18"/>
           <w:szCs w:val="20"/>
         </w:rPr>
-        <w:t>NestJS</w:t>
-      </w:r>
-      <w:proofErr w:type="spellEnd"/>
-      <w:r>
-        <w:rPr>
+        <w:t xml:space="preserve"> backend. I designed a relational database schema using </w:t>
+      </w:r>
+      <w:proofErr w:type="spellStart"/>
+      <w:r>
+        <w:rPr>
+          <w:bCs/>
           <w:iCs/>
           <w:sz w:val="18"/>
           <w:szCs w:val="20"/>
         </w:rPr>
-        <w:t xml:space="preserve"> backend. I designed a relational database schema using </w:t>
-      </w:r>
-      <w:proofErr w:type="spellStart"/>
+        <w:t>Prisma</w:t>
+      </w:r>
+      <w:proofErr w:type="spellEnd"/>
       <w:r>
         <w:rPr>
           <w:bCs/>
@@ -1275,363 +1497,123 @@
           <w:sz w:val="18"/>
           <w:szCs w:val="20"/>
         </w:rPr>
-        <w:t>Prisma</w:t>
-      </w:r>
-      <w:proofErr w:type="spellEnd"/>
-      <w:r>
-        <w:rPr>
-          <w:bCs/>
+        <w:t xml:space="preserve"> ORM</w:t>
+      </w:r>
+      <w:r>
+        <w:rPr>
           <w:iCs/>
           <w:sz w:val="18"/>
           <w:szCs w:val="20"/>
         </w:rPr>
-        <w:t xml:space="preserve"> ORM</w:t>
-      </w:r>
+        <w:t xml:space="preserve"> to manage complex many-to-many relationships, specifically for dynamic seat availability, synchronized </w:t>
+      </w:r>
+      <w:proofErr w:type="spellStart"/>
       <w:r>
         <w:rPr>
           <w:iCs/>
           <w:sz w:val="18"/>
           <w:szCs w:val="20"/>
         </w:rPr>
-        <w:t xml:space="preserve"> to manage complex many-to-many relationships, specifically for dynamic seat availability, synchronized </w:t>
-      </w:r>
-      <w:proofErr w:type="spellStart"/>
+        <w:t>showtimes</w:t>
+      </w:r>
+      <w:proofErr w:type="spellEnd"/>
       <w:r>
         <w:rPr>
           <w:iCs/>
           <w:sz w:val="18"/>
           <w:szCs w:val="20"/>
         </w:rPr>
-        <w:t>showtimes</w:t>
-      </w:r>
-      <w:proofErr w:type="spellEnd"/>
-      <w:r>
-        <w:rPr>
+        <w:t xml:space="preserve">, and user booking histories. To ensure system security, I implemented </w:t>
+      </w:r>
+      <w:r>
+        <w:rPr>
+          <w:bCs/>
           <w:iCs/>
           <w:sz w:val="18"/>
           <w:szCs w:val="20"/>
         </w:rPr>
-        <w:t xml:space="preserve">, and user booking histories. To ensure system security, I implemented </w:t>
-      </w:r>
-      <w:r>
-        <w:rPr>
-          <w:bCs/>
+        <w:t>JWT-based authentication</w:t>
+      </w:r>
+      <w:r>
+        <w:rPr>
           <w:iCs/>
           <w:sz w:val="18"/>
           <w:szCs w:val="20"/>
         </w:rPr>
-        <w:t>JWT-based authentication</w:t>
-      </w:r>
-      <w:r>
-        <w:rPr>
+        <w:t xml:space="preserve">, role-based access control (RBAC) for administrative CRUD operations, and secure password hashing using </w:t>
+      </w:r>
+      <w:proofErr w:type="spellStart"/>
+      <w:r>
+        <w:rPr>
+          <w:bCs/>
           <w:iCs/>
           <w:sz w:val="18"/>
           <w:szCs w:val="20"/>
         </w:rPr>
-        <w:t xml:space="preserve">, role-based access control (RBAC) for administrative CRUD operations, and secure password hashing using </w:t>
-      </w:r>
-      <w:proofErr w:type="spellStart"/>
-      <w:r>
-        <w:rPr>
-          <w:bCs/>
+        <w:t>Bcrypt</w:t>
+      </w:r>
+      <w:proofErr w:type="spellEnd"/>
+      <w:r>
+        <w:rPr>
           <w:iCs/>
           <w:sz w:val="18"/>
           <w:szCs w:val="20"/>
         </w:rPr>
-        <w:t>Bcrypt</w:t>
-      </w:r>
-      <w:proofErr w:type="spellEnd"/>
+        <w:t>. By structuring the backend into specialized domains (</w:t>
+      </w:r>
+      <w:proofErr w:type="spellStart"/>
       <w:r>
         <w:rPr>
           <w:iCs/>
           <w:sz w:val="18"/>
           <w:szCs w:val="20"/>
         </w:rPr>
-        <w:t>. By structuring the backend into specialized domains (</w:t>
-      </w:r>
-      <w:proofErr w:type="spellStart"/>
+        <w:t>Auth</w:t>
+      </w:r>
+      <w:proofErr w:type="spellEnd"/>
       <w:r>
         <w:rPr>
           <w:iCs/>
           <w:sz w:val="18"/>
           <w:szCs w:val="20"/>
         </w:rPr>
-        <w:t>Auth</w:t>
-      </w:r>
-      <w:proofErr w:type="spellEnd"/>
+        <w:t xml:space="preserve">, Users, Movies, </w:t>
+      </w:r>
+      <w:proofErr w:type="spellStart"/>
       <w:r>
         <w:rPr>
           <w:iCs/>
           <w:sz w:val="18"/>
           <w:szCs w:val="20"/>
         </w:rPr>
-        <w:t xml:space="preserve">, Users, Movies, </w:t>
-      </w:r>
-      <w:proofErr w:type="spellStart"/>
+        <w:t>Showtimes</w:t>
+      </w:r>
+      <w:proofErr w:type="spellEnd"/>
       <w:r>
         <w:rPr>
           <w:iCs/>
           <w:sz w:val="18"/>
           <w:szCs w:val="20"/>
         </w:rPr>
-        <w:t>Showtimes</w:t>
-      </w:r>
-      <w:proofErr w:type="spellEnd"/>
+        <w:t xml:space="preserve">, and Seats), I created a scalable </w:t>
+      </w:r>
+      <w:proofErr w:type="spellStart"/>
       <w:r>
         <w:rPr>
           <w:iCs/>
           <w:sz w:val="18"/>
           <w:szCs w:val="20"/>
         </w:rPr>
-        <w:t xml:space="preserve">, and Seats), I created a scalable </w:t>
-      </w:r>
-      <w:proofErr w:type="spellStart"/>
+        <w:t>RESTful</w:t>
+      </w:r>
+      <w:proofErr w:type="spellEnd"/>
       <w:r>
         <w:rPr>
           <w:iCs/>
           <w:sz w:val="18"/>
           <w:szCs w:val="20"/>
         </w:rPr>
-        <w:t>RESTful</w:t>
-      </w:r>
-      <w:proofErr w:type="spellEnd"/>
-      <w:r>
-        <w:rPr>
-          <w:iCs/>
-          <w:sz w:val="18"/>
-          <w:szCs w:val="20"/>
-        </w:rPr>
         <w:t xml:space="preserve"> API that maintains strict data integrity through automated input validation and standardized DTOs.</w:t>
-      </w:r>
-    </w:p>
-    <w:p>
-      <w:pPr>
-        <w:spacing w:before="60" w:line="240" w:lineRule="auto"/>
-        <w:ind w:left="-851" w:right="-897"/>
-        <w:jc w:val="both"/>
-        <w:rPr>
-          <w:iCs/>
-          <w:sz w:val="18"/>
-          <w:szCs w:val="20"/>
-        </w:rPr>
-      </w:pPr>
-    </w:p>
-    <w:p>
-      <w:pPr>
-        <w:widowControl w:val="0"/>
-        <w:tabs>
-          <w:tab w:val="right" w:pos="10206"/>
-        </w:tabs>
-        <w:spacing w:line="240" w:lineRule="auto"/>
-        <w:ind w:left="-851" w:right="-703"/>
-        <w:jc w:val="both"/>
-        <w:rPr>
-          <w:sz w:val="18"/>
-          <w:szCs w:val="20"/>
-        </w:rPr>
-      </w:pPr>
-      <w:proofErr w:type="spellStart"/>
-      <w:r>
-        <w:rPr>
-          <w:b/>
-          <w:sz w:val="18"/>
-          <w:szCs w:val="20"/>
-        </w:rPr>
-        <w:t>RevouShop</w:t>
-      </w:r>
-      <w:proofErr w:type="spellEnd"/>
-      <w:r>
-        <w:rPr>
-          <w:b/>
-          <w:sz w:val="18"/>
-          <w:szCs w:val="20"/>
-        </w:rPr>
-        <w:t>,</w:t>
-      </w:r>
-      <w:r>
-        <w:rPr>
-          <w:sz w:val="18"/>
-          <w:szCs w:val="20"/>
-        </w:rPr>
-        <w:t xml:space="preserve"> </w:t>
-      </w:r>
-      <w:proofErr w:type="spellStart"/>
-      <w:r>
-        <w:rPr>
-          <w:b/>
-          <w:bCs/>
-          <w:sz w:val="18"/>
-          <w:szCs w:val="20"/>
-        </w:rPr>
-        <w:t>Revou</w:t>
-      </w:r>
-      <w:proofErr w:type="spellEnd"/>
-      <w:r>
-        <w:rPr>
-          <w:b/>
-          <w:bCs/>
-          <w:sz w:val="18"/>
-          <w:szCs w:val="20"/>
-        </w:rPr>
-        <w:t xml:space="preserve"> </w:t>
-      </w:r>
-      <w:proofErr w:type="spellStart"/>
-      <w:r>
-        <w:rPr>
-          <w:b/>
-          <w:bCs/>
-          <w:sz w:val="18"/>
-          <w:szCs w:val="20"/>
-        </w:rPr>
-        <w:t>Fullstack</w:t>
-      </w:r>
-      <w:proofErr w:type="spellEnd"/>
-      <w:r>
-        <w:rPr>
-          <w:b/>
-          <w:bCs/>
-          <w:sz w:val="18"/>
-          <w:szCs w:val="20"/>
-        </w:rPr>
-        <w:t xml:space="preserve"> Software Engineer</w:t>
-      </w:r>
-      <w:r>
-        <w:rPr>
-          <w:b/>
-          <w:bCs/>
-          <w:sz w:val="18"/>
-          <w:szCs w:val="20"/>
-        </w:rPr>
-        <w:t xml:space="preserve"> </w:t>
-      </w:r>
-      <w:r>
-        <w:rPr>
-          <w:b/>
-          <w:bCs/>
-          <w:sz w:val="18"/>
-          <w:szCs w:val="20"/>
-        </w:rPr>
-        <w:tab/>
-      </w:r>
-      <w:r>
-        <w:rPr>
-          <w:b/>
-          <w:bCs/>
-          <w:sz w:val="18"/>
-          <w:szCs w:val="20"/>
-        </w:rPr>
-        <w:t>Oct, 2025</w:t>
-      </w:r>
-    </w:p>
-    <w:p>
-      <w:pPr>
-        <w:widowControl w:val="0"/>
-        <w:spacing w:line="240" w:lineRule="auto"/>
-        <w:ind w:left="-851" w:right="-897"/>
-        <w:jc w:val="both"/>
-        <w:rPr>
-          <w:sz w:val="18"/>
-          <w:szCs w:val="20"/>
-        </w:rPr>
-      </w:pPr>
-      <w:r>
-        <w:rPr>
-          <w:sz w:val="18"/>
-          <w:szCs w:val="20"/>
-        </w:rPr>
-        <w:t xml:space="preserve">I built </w:t>
-      </w:r>
-      <w:proofErr w:type="spellStart"/>
-      <w:r>
-        <w:rPr>
-          <w:bCs/>
-          <w:sz w:val="18"/>
-          <w:szCs w:val="20"/>
-        </w:rPr>
-        <w:t>RevouShop</w:t>
-      </w:r>
-      <w:proofErr w:type="spellEnd"/>
-      <w:r>
-        <w:rPr>
-          <w:sz w:val="18"/>
-          <w:szCs w:val="20"/>
-        </w:rPr>
-        <w:t xml:space="preserve">, a full-featured e-commerce application using </w:t>
-      </w:r>
-      <w:r>
-        <w:rPr>
-          <w:bCs/>
-          <w:sz w:val="18"/>
-          <w:szCs w:val="20"/>
-        </w:rPr>
-        <w:t>Next.js 15</w:t>
-      </w:r>
-      <w:r>
-        <w:rPr>
-          <w:sz w:val="18"/>
-          <w:szCs w:val="20"/>
-        </w:rPr>
-        <w:t xml:space="preserve">. I developed the entire frontend architecture, utilizing the </w:t>
-      </w:r>
-      <w:r>
-        <w:rPr>
-          <w:bCs/>
-          <w:sz w:val="18"/>
-          <w:szCs w:val="20"/>
-        </w:rPr>
-        <w:t>React Context API</w:t>
-      </w:r>
-      <w:r>
-        <w:rPr>
-          <w:sz w:val="18"/>
-          <w:szCs w:val="20"/>
-        </w:rPr>
-        <w:t xml:space="preserve"> for real-time cart state management and </w:t>
-      </w:r>
-      <w:r>
-        <w:rPr>
-          <w:bCs/>
-          <w:sz w:val="18"/>
-          <w:szCs w:val="20"/>
-        </w:rPr>
-        <w:t>Tailwind CSS</w:t>
-      </w:r>
-      <w:r>
-        <w:rPr>
-          <w:sz w:val="18"/>
-          <w:szCs w:val="20"/>
-        </w:rPr>
-        <w:t xml:space="preserve"> for a mobile-responsive UI. I also implemented an Admin panel with CRUD capabilities and optimized the app with </w:t>
-      </w:r>
-      <w:r>
-        <w:rPr>
-          <w:bCs/>
-          <w:sz w:val="18"/>
-          <w:szCs w:val="20"/>
-        </w:rPr>
-        <w:t>Server-Side Rendering (SSR)</w:t>
-      </w:r>
-      <w:r>
-        <w:rPr>
-          <w:sz w:val="18"/>
-          <w:szCs w:val="20"/>
-        </w:rPr>
-        <w:t xml:space="preserve">. To ensure production quality, I authored automated unit tests with </w:t>
-      </w:r>
-      <w:r>
-        <w:rPr>
-          <w:bCs/>
-          <w:sz w:val="18"/>
-          <w:szCs w:val="20"/>
-        </w:rPr>
-        <w:t>Jest</w:t>
-      </w:r>
-      <w:r>
-        <w:rPr>
-          <w:sz w:val="18"/>
-          <w:szCs w:val="20"/>
-        </w:rPr>
-        <w:t>, covering login, cart logic, and admin interactions.</w:t>
       </w:r>
     </w:p>
     <w:p>
@@ -2027,6 +2009,7 @@
           <w:sz w:val="18"/>
           <w:szCs w:val="20"/>
         </w:rPr>
+        <w:lastRenderedPageBreak/>
         <w:t xml:space="preserve">Certification: </w:t>
       </w:r>
     </w:p>
@@ -2059,7 +2042,7 @@
         </w:rPr>
         <w:t xml:space="preserve">. </w:t>
       </w:r>
-      <w:hyperlink r:id="rId10" w:history="1">
+      <w:hyperlink r:id="rId9" w:history="1">
         <w:r>
           <w:rPr>
             <w:rStyle w:val="Hyperlink"/>

</xml_diff>

<commit_message>
docs: updated CV file
</commit_message>
<xml_diff>
--- a/public/CV_Virginia Celine Oei.docx
+++ b/public/CV_Virginia Celine Oei.docx
@@ -38,59 +38,90 @@
     <w:p>
       <w:pPr>
         <w:spacing w:line="240" w:lineRule="auto"/>
+        <w:ind w:left="-851" w:right="-900"/>
+        <w:jc w:val="center"/>
+        <w:rPr>
+          <w:b/>
+          <w:bCs/>
+          <w:sz w:val="28"/>
+          <w:szCs w:val="32"/>
+        </w:rPr>
+      </w:pPr>
+      <w:r>
+        <w:rPr>
+          <w:b/>
+          <w:bCs/>
+          <w:sz w:val="28"/>
+          <w:szCs w:val="32"/>
+        </w:rPr>
+        <w:t>Frontend Developer</w:t>
+      </w:r>
+    </w:p>
+    <w:p>
+      <w:pPr>
+        <w:spacing w:line="240" w:lineRule="auto"/>
         <w:ind w:left="-851" w:right="-897"/>
         <w:jc w:val="center"/>
         <w:rPr>
-          <w:sz w:val="18"/>
-          <w:szCs w:val="20"/>
-        </w:rPr>
-      </w:pPr>
-      <w:r>
-        <w:rPr>
-          <w:b/>
-          <w:bCs/>
-          <w:sz w:val="18"/>
-          <w:szCs w:val="20"/>
-        </w:rPr>
-        <w:t>O811438785</w:t>
-      </w:r>
-      <w:r>
-        <w:rPr>
-          <w:b/>
-          <w:bCs/>
-          <w:sz w:val="18"/>
-          <w:szCs w:val="20"/>
-        </w:rPr>
-        <w:t xml:space="preserve"> I </w:t>
-      </w:r>
-      <w:r>
-        <w:rPr>
-          <w:b/>
-          <w:bCs/>
-          <w:sz w:val="18"/>
-          <w:szCs w:val="20"/>
-        </w:rPr>
-        <w:t xml:space="preserve">email: </w:t>
-      </w:r>
-      <w:r>
-        <w:rPr>
-          <w:b/>
-          <w:bCs/>
-          <w:sz w:val="18"/>
-          <w:szCs w:val="20"/>
-        </w:rPr>
-        <w:t>celineoei04@gmail.com</w:t>
-      </w:r>
-      <w:r>
-        <w:rPr>
-          <w:b/>
-          <w:bCs/>
-          <w:sz w:val="18"/>
-          <w:szCs w:val="20"/>
-        </w:rPr>
-        <w:br/>
-      </w:r>
+          <w:b/>
+          <w:bCs/>
+          <w:sz w:val="18"/>
+          <w:szCs w:val="20"/>
+        </w:rPr>
+      </w:pPr>
       <w:hyperlink r:id="rId6" w:history="1">
+        <w:r>
+          <w:rPr>
+            <w:rStyle w:val="Hyperlink"/>
+            <w:b/>
+            <w:bCs/>
+            <w:sz w:val="18"/>
+            <w:szCs w:val="20"/>
+          </w:rPr>
+          <w:t>0</w:t>
+        </w:r>
+        <w:r>
+          <w:rPr>
+            <w:rStyle w:val="Hyperlink"/>
+            <w:b/>
+            <w:bCs/>
+            <w:sz w:val="18"/>
+            <w:szCs w:val="20"/>
+          </w:rPr>
+          <w:t>811438785</w:t>
+        </w:r>
+      </w:hyperlink>
+      <w:r>
+        <w:rPr>
+          <w:b/>
+          <w:bCs/>
+          <w:sz w:val="18"/>
+          <w:szCs w:val="20"/>
+        </w:rPr>
+        <w:t xml:space="preserve"> | </w:t>
+      </w:r>
+      <w:hyperlink r:id="rId7" w:history="1">
+        <w:r>
+          <w:rPr>
+            <w:rStyle w:val="Hyperlink"/>
+            <w:b/>
+            <w:bCs/>
+            <w:sz w:val="18"/>
+            <w:szCs w:val="20"/>
+          </w:rPr>
+          <w:t>celineoei04@gmail.com</w:t>
+        </w:r>
+      </w:hyperlink>
+      <w:r>
+        <w:rPr>
+          <w:b/>
+          <w:bCs/>
+          <w:sz w:val="18"/>
+          <w:szCs w:val="20"/>
+        </w:rPr>
+        <w:t xml:space="preserve"> | </w:t>
+      </w:r>
+      <w:hyperlink r:id="rId8" w:history="1">
         <w:r>
           <w:rPr>
             <w:rStyle w:val="Hyperlink"/>
@@ -111,37 +142,18 @@
         </w:rPr>
         <w:t xml:space="preserve"> | </w:t>
       </w:r>
-      <w:bookmarkStart w:id="0" w:name="_GoBack"/>
-      <w:bookmarkEnd w:id="0"/>
-      <w:r>
-        <w:fldChar w:fldCharType="begin"/>
-      </w:r>
-      <w:r>
-        <w:instrText>HYPERLINK "https://my-portfolio-celine44.vercel.app"</w:instrText>
-      </w:r>
-      <w:r>
-        <w:fldChar w:fldCharType="separate"/>
-      </w:r>
-      <w:r>
-        <w:rPr>
-          <w:rStyle w:val="Hyperlink"/>
-          <w:b/>
-          <w:bCs/>
-          <w:sz w:val="18"/>
-          <w:szCs w:val="20"/>
-        </w:rPr>
-        <w:t>Portfolio</w:t>
-      </w:r>
-      <w:r>
-        <w:rPr>
-          <w:rStyle w:val="Hyperlink"/>
-          <w:b/>
-          <w:bCs/>
-          <w:sz w:val="18"/>
-          <w:szCs w:val="20"/>
-        </w:rPr>
-        <w:fldChar w:fldCharType="end"/>
-      </w:r>
+      <w:hyperlink r:id="rId9" w:history="1">
+        <w:r>
+          <w:rPr>
+            <w:rStyle w:val="Hyperlink"/>
+            <w:b/>
+            <w:bCs/>
+            <w:sz w:val="18"/>
+            <w:szCs w:val="20"/>
+          </w:rPr>
+          <w:t>Portfolio</w:t>
+        </w:r>
+      </w:hyperlink>
       <w:r>
         <w:rPr>
           <w:b/>
@@ -346,8 +358,12 @@
     </w:p>
     <w:p>
       <w:pPr>
+        <w:tabs>
+          <w:tab w:val="left" w:pos="10206"/>
+        </w:tabs>
         <w:spacing w:line="240" w:lineRule="auto"/>
-        <w:ind w:left="-851" w:right="-897"/>
+        <w:ind w:left="-851" w:right="-896"/>
+        <w:jc w:val="both"/>
         <w:rPr>
           <w:sz w:val="18"/>
           <w:szCs w:val="20"/>
@@ -362,26 +378,325 @@
         <w:spacing w:after="120" w:line="240" w:lineRule="auto"/>
         <w:ind w:left="-851" w:right="-897"/>
         <w:rPr>
-          <w:b/>
-          <w:bCs/>
-          <w:sz w:val="18"/>
-          <w:szCs w:val="20"/>
-        </w:rPr>
-      </w:pPr>
-      <w:r>
-        <w:rPr>
-          <w:b/>
-          <w:bCs/>
-          <w:sz w:val="18"/>
-          <w:szCs w:val="20"/>
-        </w:rPr>
-        <w:t>Education</w:t>
+          <w:sz w:val="18"/>
+          <w:szCs w:val="20"/>
+        </w:rPr>
+      </w:pPr>
+      <w:r>
+        <w:rPr>
+          <w:b/>
+          <w:bCs/>
+          <w:sz w:val="18"/>
+          <w:szCs w:val="20"/>
+        </w:rPr>
+        <w:t>Skills</w:t>
       </w:r>
     </w:p>
     <w:p>
       <w:pPr>
+        <w:widowControl w:val="0"/>
+        <w:spacing w:line="240" w:lineRule="auto"/>
+        <w:ind w:left="-851" w:right="-897"/>
+        <w:jc w:val="both"/>
+        <w:rPr>
+          <w:b/>
+          <w:bCs/>
+          <w:sz w:val="18"/>
+          <w:szCs w:val="20"/>
+        </w:rPr>
+      </w:pPr>
+      <w:r>
+        <w:rPr>
+          <w:b/>
+          <w:bCs/>
+          <w:sz w:val="18"/>
+          <w:szCs w:val="20"/>
+        </w:rPr>
+        <w:t>Technical Skill:</w:t>
+      </w:r>
+      <w:r>
+        <w:rPr>
+          <w:b/>
+          <w:bCs/>
+          <w:sz w:val="18"/>
+          <w:szCs w:val="20"/>
+        </w:rPr>
+        <w:t xml:space="preserve"> </w:t>
+      </w:r>
+      <w:r>
+        <w:rPr>
+          <w:bCs/>
+          <w:sz w:val="18"/>
+          <w:szCs w:val="20"/>
+        </w:rPr>
+        <w:t xml:space="preserve">HTML, CSS, Tailwind CSS, </w:t>
+      </w:r>
+      <w:r>
+        <w:rPr>
+          <w:bCs/>
+          <w:sz w:val="18"/>
+          <w:szCs w:val="20"/>
+        </w:rPr>
+        <w:t xml:space="preserve">JavaScript, </w:t>
+      </w:r>
+      <w:proofErr w:type="spellStart"/>
+      <w:r>
+        <w:rPr>
+          <w:bCs/>
+          <w:sz w:val="18"/>
+          <w:szCs w:val="20"/>
+        </w:rPr>
+        <w:t>TypeScript</w:t>
+      </w:r>
+      <w:proofErr w:type="spellEnd"/>
+      <w:r>
+        <w:rPr>
+          <w:bCs/>
+          <w:sz w:val="18"/>
+          <w:szCs w:val="20"/>
+        </w:rPr>
+        <w:t>,</w:t>
+      </w:r>
+      <w:r>
+        <w:rPr>
+          <w:bCs/>
+          <w:sz w:val="18"/>
+          <w:szCs w:val="20"/>
+        </w:rPr>
+        <w:t xml:space="preserve"> </w:t>
+      </w:r>
+      <w:r>
+        <w:rPr>
+          <w:bCs/>
+          <w:sz w:val="18"/>
+          <w:szCs w:val="20"/>
+        </w:rPr>
+        <w:t>React, Next.js</w:t>
+      </w:r>
+      <w:r>
+        <w:rPr>
+          <w:bCs/>
+          <w:sz w:val="18"/>
+          <w:szCs w:val="20"/>
+        </w:rPr>
+        <w:t xml:space="preserve">, </w:t>
+      </w:r>
+      <w:proofErr w:type="spellStart"/>
+      <w:r>
+        <w:rPr>
+          <w:bCs/>
+          <w:sz w:val="18"/>
+          <w:szCs w:val="20"/>
+        </w:rPr>
+        <w:t>Vite</w:t>
+      </w:r>
+      <w:proofErr w:type="spellEnd"/>
+      <w:r>
+        <w:rPr>
+          <w:b/>
+          <w:bCs/>
+          <w:sz w:val="18"/>
+          <w:szCs w:val="20"/>
+        </w:rPr>
+        <w:t xml:space="preserve">, </w:t>
+      </w:r>
+      <w:proofErr w:type="spellStart"/>
+      <w:r>
+        <w:rPr>
+          <w:sz w:val="18"/>
+          <w:szCs w:val="20"/>
+        </w:rPr>
+        <w:t>NestJs</w:t>
+      </w:r>
+      <w:proofErr w:type="spellEnd"/>
+      <w:r>
+        <w:rPr>
+          <w:b/>
+          <w:bCs/>
+          <w:sz w:val="18"/>
+          <w:szCs w:val="20"/>
+        </w:rPr>
+        <w:t xml:space="preserve">, </w:t>
+      </w:r>
+      <w:proofErr w:type="spellStart"/>
+      <w:r>
+        <w:rPr>
+          <w:bCs/>
+          <w:sz w:val="18"/>
+          <w:szCs w:val="20"/>
+        </w:rPr>
+        <w:t>PostgreSQL</w:t>
+      </w:r>
+      <w:proofErr w:type="spellEnd"/>
+      <w:r>
+        <w:rPr>
+          <w:bCs/>
+          <w:sz w:val="18"/>
+          <w:szCs w:val="20"/>
+        </w:rPr>
+        <w:t xml:space="preserve">, </w:t>
+      </w:r>
+      <w:proofErr w:type="spellStart"/>
+      <w:r>
+        <w:rPr>
+          <w:bCs/>
+          <w:sz w:val="18"/>
+          <w:szCs w:val="20"/>
+        </w:rPr>
+        <w:t>Prisma</w:t>
+      </w:r>
+      <w:proofErr w:type="spellEnd"/>
+      <w:r>
+        <w:rPr>
+          <w:bCs/>
+          <w:sz w:val="18"/>
+          <w:szCs w:val="20"/>
+        </w:rPr>
+        <w:t>, Swagger UI</w:t>
+      </w:r>
+      <w:r>
+        <w:rPr>
+          <w:bCs/>
+          <w:sz w:val="18"/>
+          <w:szCs w:val="20"/>
+        </w:rPr>
+        <w:t xml:space="preserve">, </w:t>
+      </w:r>
+      <w:proofErr w:type="spellStart"/>
+      <w:r>
+        <w:rPr>
+          <w:bCs/>
+          <w:sz w:val="18"/>
+          <w:szCs w:val="20"/>
+        </w:rPr>
+        <w:t>NodeJs</w:t>
+      </w:r>
+      <w:proofErr w:type="spellEnd"/>
+      <w:r>
+        <w:rPr>
+          <w:bCs/>
+          <w:sz w:val="18"/>
+          <w:szCs w:val="20"/>
+        </w:rPr>
+        <w:t>, Postman</w:t>
+      </w:r>
+    </w:p>
+    <w:p>
+      <w:pPr>
+        <w:widowControl w:val="0"/>
+        <w:spacing w:line="240" w:lineRule="auto"/>
+        <w:ind w:left="-851" w:right="-897"/>
+        <w:jc w:val="both"/>
+        <w:rPr>
+          <w:b/>
+          <w:bCs/>
+          <w:sz w:val="18"/>
+          <w:szCs w:val="20"/>
+        </w:rPr>
+      </w:pPr>
+    </w:p>
+    <w:p>
+      <w:pPr>
+        <w:widowControl w:val="0"/>
+        <w:spacing w:line="240" w:lineRule="auto"/>
+        <w:ind w:left="-851" w:right="-897"/>
+        <w:jc w:val="both"/>
+        <w:rPr>
+          <w:sz w:val="18"/>
+          <w:szCs w:val="20"/>
+        </w:rPr>
+      </w:pPr>
+      <w:r>
+        <w:rPr>
+          <w:b/>
+          <w:bCs/>
+          <w:sz w:val="18"/>
+          <w:szCs w:val="20"/>
+        </w:rPr>
+        <w:t>Soft Skills:</w:t>
+      </w:r>
+      <w:r>
+        <w:rPr>
+          <w:sz w:val="18"/>
+          <w:szCs w:val="20"/>
+        </w:rPr>
+        <w:t xml:space="preserve"> Problem-Solving, Communication, Adaptability</w:t>
+      </w:r>
+      <w:r>
+        <w:rPr>
+          <w:sz w:val="18"/>
+          <w:szCs w:val="20"/>
+        </w:rPr>
+        <w:t>, Collaboration, Design-Thinking, Critical Thinking</w:t>
+      </w:r>
+      <w:r>
+        <w:rPr>
+          <w:sz w:val="18"/>
+          <w:szCs w:val="20"/>
+        </w:rPr>
+        <w:t>, Teamwork</w:t>
+      </w:r>
+      <w:bookmarkStart w:id="0" w:name="_GoBack"/>
+      <w:bookmarkEnd w:id="0"/>
+    </w:p>
+    <w:p>
+      <w:pPr>
+        <w:widowControl w:val="0"/>
+        <w:spacing w:line="240" w:lineRule="auto"/>
+        <w:ind w:left="-851" w:right="-897"/>
+        <w:jc w:val="both"/>
+        <w:rPr>
+          <w:sz w:val="18"/>
+          <w:szCs w:val="20"/>
+        </w:rPr>
+      </w:pPr>
+    </w:p>
+    <w:p>
+      <w:pPr>
+        <w:widowControl w:val="0"/>
+        <w:spacing w:line="240" w:lineRule="auto"/>
+        <w:ind w:left="-851" w:right="-897"/>
+        <w:jc w:val="both"/>
+        <w:rPr>
+          <w:sz w:val="18"/>
+          <w:szCs w:val="20"/>
+        </w:rPr>
+      </w:pPr>
+      <w:proofErr w:type="gramStart"/>
+      <w:r>
+        <w:rPr>
+          <w:b/>
+          <w:bCs/>
+          <w:sz w:val="18"/>
+          <w:szCs w:val="20"/>
+        </w:rPr>
+        <w:t>Language :</w:t>
+      </w:r>
+      <w:proofErr w:type="gramEnd"/>
+      <w:r>
+        <w:rPr>
+          <w:sz w:val="18"/>
+          <w:szCs w:val="20"/>
+        </w:rPr>
+        <w:t xml:space="preserve"> Indonesia, English</w:t>
+      </w:r>
+    </w:p>
+    <w:p>
+      <w:pPr>
+        <w:widowControl w:val="0"/>
+        <w:spacing w:line="240" w:lineRule="auto"/>
+        <w:ind w:left="-851" w:right="-897"/>
+        <w:jc w:val="both"/>
+        <w:rPr>
+          <w:sz w:val="18"/>
+          <w:szCs w:val="20"/>
+        </w:rPr>
+      </w:pPr>
+    </w:p>
+    <w:p>
+      <w:pPr>
         <w:tabs>
-          <w:tab w:val="right" w:pos="10206"/>
+          <w:tab w:val="left" w:pos="10206"/>
         </w:tabs>
         <w:spacing w:line="240" w:lineRule="auto"/>
         <w:ind w:left="-851" w:right="-896"/>
@@ -391,469 +706,6 @@
           <w:szCs w:val="20"/>
         </w:rPr>
       </w:pPr>
-      <w:proofErr w:type="spellStart"/>
-      <w:r>
-        <w:rPr>
-          <w:b/>
-          <w:bCs/>
-          <w:sz w:val="18"/>
-          <w:szCs w:val="20"/>
-        </w:rPr>
-        <w:t>RevoU</w:t>
-      </w:r>
-      <w:proofErr w:type="spellEnd"/>
-      <w:r>
-        <w:rPr>
-          <w:b/>
-          <w:bCs/>
-          <w:sz w:val="18"/>
-          <w:szCs w:val="20"/>
-        </w:rPr>
-        <w:t xml:space="preserve"> </w:t>
-      </w:r>
-      <w:r>
-        <w:rPr>
-          <w:b/>
-          <w:sz w:val="18"/>
-          <w:szCs w:val="20"/>
-        </w:rPr>
-        <w:t xml:space="preserve">Full-stack Software </w:t>
-      </w:r>
-      <w:r>
-        <w:rPr>
-          <w:b/>
-          <w:sz w:val="18"/>
-          <w:szCs w:val="20"/>
-        </w:rPr>
-        <w:t>Engineering</w:t>
-      </w:r>
-      <w:r>
-        <w:rPr>
-          <w:b/>
-          <w:sz w:val="18"/>
-          <w:szCs w:val="20"/>
-        </w:rPr>
-        <w:tab/>
-      </w:r>
-      <w:r>
-        <w:rPr>
-          <w:b/>
-          <w:sz w:val="18"/>
-          <w:szCs w:val="20"/>
-        </w:rPr>
-        <w:t xml:space="preserve">July, 2025 – </w:t>
-      </w:r>
-      <w:r>
-        <w:rPr>
-          <w:b/>
-          <w:sz w:val="18"/>
-          <w:szCs w:val="20"/>
-        </w:rPr>
-        <w:t>Jan</w:t>
-      </w:r>
-      <w:r>
-        <w:rPr>
-          <w:b/>
-          <w:sz w:val="18"/>
-          <w:szCs w:val="20"/>
-        </w:rPr>
-        <w:t>, 2026</w:t>
-      </w:r>
-      <w:r>
-        <w:rPr>
-          <w:b/>
-          <w:i/>
-          <w:iCs/>
-          <w:sz w:val="18"/>
-          <w:szCs w:val="20"/>
-        </w:rPr>
-        <w:br/>
-      </w:r>
-      <w:proofErr w:type="gramStart"/>
-      <w:r>
-        <w:rPr>
-          <w:sz w:val="18"/>
-          <w:szCs w:val="20"/>
-        </w:rPr>
-        <w:t>Completed</w:t>
-      </w:r>
-      <w:proofErr w:type="gramEnd"/>
-      <w:r>
-        <w:rPr>
-          <w:sz w:val="18"/>
-          <w:szCs w:val="20"/>
-        </w:rPr>
-        <w:t xml:space="preserve"> an intensive 29-week Full-Stack Software Engineering </w:t>
-      </w:r>
-      <w:proofErr w:type="spellStart"/>
-      <w:r>
-        <w:rPr>
-          <w:sz w:val="18"/>
-          <w:szCs w:val="20"/>
-        </w:rPr>
-        <w:t>bootcamp</w:t>
-      </w:r>
-      <w:proofErr w:type="spellEnd"/>
-      <w:r>
-        <w:rPr>
-          <w:sz w:val="18"/>
-          <w:szCs w:val="20"/>
-        </w:rPr>
-        <w:t xml:space="preserve"> covering frontend, backend, and </w:t>
-      </w:r>
-      <w:proofErr w:type="spellStart"/>
-      <w:r>
-        <w:rPr>
-          <w:sz w:val="18"/>
-          <w:szCs w:val="20"/>
-        </w:rPr>
-        <w:t>fullstack</w:t>
-      </w:r>
-      <w:proofErr w:type="spellEnd"/>
-      <w:r>
-        <w:rPr>
-          <w:sz w:val="18"/>
-          <w:szCs w:val="20"/>
-        </w:rPr>
-        <w:t xml:space="preserve"> development through hands-on projects</w:t>
-      </w:r>
-    </w:p>
-    <w:p>
-      <w:pPr>
-        <w:tabs>
-          <w:tab w:val="left" w:pos="8476"/>
-        </w:tabs>
-        <w:spacing w:line="240" w:lineRule="auto"/>
-        <w:ind w:left="-851" w:right="-897"/>
-        <w:jc w:val="both"/>
-        <w:rPr>
-          <w:b/>
-          <w:sz w:val="18"/>
-          <w:szCs w:val="20"/>
-        </w:rPr>
-      </w:pPr>
-      <w:r>
-        <w:rPr>
-          <w:b/>
-          <w:sz w:val="18"/>
-          <w:szCs w:val="20"/>
-        </w:rPr>
-        <w:t xml:space="preserve">Final Project: </w:t>
-      </w:r>
-      <w:proofErr w:type="spellStart"/>
-      <w:r>
-        <w:rPr>
-          <w:b/>
-          <w:bCs/>
-          <w:sz w:val="18"/>
-          <w:szCs w:val="20"/>
-        </w:rPr>
-        <w:t>TiBooth</w:t>
-      </w:r>
-      <w:proofErr w:type="spellEnd"/>
-      <w:r>
-        <w:rPr>
-          <w:b/>
-          <w:bCs/>
-          <w:sz w:val="18"/>
-          <w:szCs w:val="20"/>
-        </w:rPr>
-        <w:t xml:space="preserve"> Movie Ticketing Website</w:t>
-      </w:r>
-    </w:p>
-    <w:p>
-      <w:pPr>
-        <w:tabs>
-          <w:tab w:val="left" w:pos="8476"/>
-        </w:tabs>
-        <w:spacing w:line="240" w:lineRule="auto"/>
-        <w:ind w:left="-851" w:right="-897"/>
-        <w:jc w:val="both"/>
-        <w:rPr>
-          <w:sz w:val="18"/>
-          <w:szCs w:val="20"/>
-        </w:rPr>
-      </w:pPr>
-      <w:r>
-        <w:rPr>
-          <w:sz w:val="18"/>
-          <w:szCs w:val="20"/>
-        </w:rPr>
-        <w:t xml:space="preserve">This project is a </w:t>
-      </w:r>
-      <w:proofErr w:type="spellStart"/>
-      <w:r>
-        <w:rPr>
-          <w:sz w:val="18"/>
-          <w:szCs w:val="20"/>
-        </w:rPr>
-        <w:t>fullstack</w:t>
-      </w:r>
-      <w:proofErr w:type="spellEnd"/>
-      <w:r>
-        <w:rPr>
-          <w:sz w:val="18"/>
-          <w:szCs w:val="20"/>
-        </w:rPr>
-        <w:t xml:space="preserve"> movie ticket booking web application that provides a seamless reservation experience through an integrated frontend and backend system. The platform allows users to browse movie catalogs, view real-time theater schedules, select seats, and manage bookings through a dynamic user interface.</w:t>
-      </w:r>
-    </w:p>
-    <w:p>
-      <w:pPr>
-        <w:tabs>
-          <w:tab w:val="left" w:pos="8476"/>
-        </w:tabs>
-        <w:spacing w:line="240" w:lineRule="auto"/>
-        <w:ind w:left="-851" w:right="-897"/>
-        <w:jc w:val="both"/>
-        <w:rPr>
-          <w:b/>
-          <w:sz w:val="18"/>
-          <w:szCs w:val="20"/>
-        </w:rPr>
-      </w:pPr>
-      <w:r>
-        <w:rPr>
-          <w:b/>
-          <w:sz w:val="18"/>
-          <w:szCs w:val="20"/>
-        </w:rPr>
-        <w:t xml:space="preserve">Link to </w:t>
-      </w:r>
-      <w:proofErr w:type="gramStart"/>
-      <w:r>
-        <w:rPr>
-          <w:b/>
-          <w:sz w:val="18"/>
-          <w:szCs w:val="20"/>
-        </w:rPr>
-        <w:t>frontend :</w:t>
-      </w:r>
-      <w:proofErr w:type="gramEnd"/>
-      <w:r>
-        <w:rPr>
-          <w:b/>
-          <w:sz w:val="18"/>
-          <w:szCs w:val="20"/>
-        </w:rPr>
-        <w:t xml:space="preserve"> </w:t>
-      </w:r>
-      <w:hyperlink r:id="rId7" w:history="1">
-        <w:r>
-          <w:rPr>
-            <w:rStyle w:val="Hyperlink"/>
-            <w:b/>
-            <w:sz w:val="18"/>
-            <w:szCs w:val="20"/>
-          </w:rPr>
-          <w:t>https://github.com/Cel44/crack-fe-Cel44.git</w:t>
-        </w:r>
-      </w:hyperlink>
-    </w:p>
-    <w:p>
-      <w:pPr>
-        <w:tabs>
-          <w:tab w:val="left" w:pos="8476"/>
-        </w:tabs>
-        <w:spacing w:line="240" w:lineRule="auto"/>
-        <w:ind w:left="-851" w:right="-897"/>
-        <w:jc w:val="both"/>
-        <w:rPr>
-          <w:b/>
-          <w:sz w:val="18"/>
-          <w:szCs w:val="20"/>
-        </w:rPr>
-      </w:pPr>
-      <w:r>
-        <w:rPr>
-          <w:b/>
-          <w:sz w:val="18"/>
-          <w:szCs w:val="20"/>
-        </w:rPr>
-        <w:t xml:space="preserve">Link to backend: </w:t>
-      </w:r>
-      <w:hyperlink r:id="rId8" w:history="1">
-        <w:r>
-          <w:rPr>
-            <w:rStyle w:val="Hyperlink"/>
-            <w:b/>
-            <w:sz w:val="18"/>
-            <w:szCs w:val="20"/>
-          </w:rPr>
-          <w:t>https://github.com/Cel44/crack-be-Cel44.git</w:t>
-        </w:r>
-      </w:hyperlink>
-    </w:p>
-    <w:p>
-      <w:pPr>
-        <w:spacing w:line="240" w:lineRule="auto"/>
-        <w:ind w:left="-851" w:right="-846"/>
-        <w:jc w:val="both"/>
-        <w:rPr>
-          <w:sz w:val="18"/>
-          <w:szCs w:val="20"/>
-        </w:rPr>
-      </w:pPr>
-    </w:p>
-    <w:p>
-      <w:pPr>
-        <w:tabs>
-          <w:tab w:val="right" w:pos="10206"/>
-        </w:tabs>
-        <w:spacing w:line="240" w:lineRule="auto"/>
-        <w:ind w:left="-851" w:right="-896"/>
-        <w:jc w:val="both"/>
-        <w:rPr>
-          <w:sz w:val="18"/>
-          <w:szCs w:val="20"/>
-        </w:rPr>
-      </w:pPr>
-      <w:proofErr w:type="spellStart"/>
-      <w:r>
-        <w:rPr>
-          <w:b/>
-          <w:bCs/>
-          <w:sz w:val="18"/>
-          <w:szCs w:val="20"/>
-        </w:rPr>
-        <w:t>Universitas</w:t>
-      </w:r>
-      <w:proofErr w:type="spellEnd"/>
-      <w:r>
-        <w:rPr>
-          <w:b/>
-          <w:bCs/>
-          <w:sz w:val="18"/>
-          <w:szCs w:val="20"/>
-        </w:rPr>
-        <w:t xml:space="preserve"> Surabaya</w:t>
-      </w:r>
-      <w:r>
-        <w:rPr>
-          <w:b/>
-          <w:sz w:val="18"/>
-          <w:szCs w:val="20"/>
-        </w:rPr>
-        <w:t xml:space="preserve"> </w:t>
-      </w:r>
-      <w:r>
-        <w:rPr>
-          <w:b/>
-          <w:sz w:val="18"/>
-          <w:szCs w:val="20"/>
-        </w:rPr>
-        <w:tab/>
-      </w:r>
-      <w:r>
-        <w:rPr>
-          <w:b/>
-          <w:sz w:val="18"/>
-          <w:szCs w:val="20"/>
-        </w:rPr>
-        <w:t>July</w:t>
-      </w:r>
-      <w:r>
-        <w:rPr>
-          <w:b/>
-          <w:sz w:val="18"/>
-          <w:szCs w:val="20"/>
-        </w:rPr>
-        <w:t xml:space="preserve">, </w:t>
-      </w:r>
-      <w:r>
-        <w:rPr>
-          <w:b/>
-          <w:sz w:val="18"/>
-          <w:szCs w:val="20"/>
-        </w:rPr>
-        <w:t>2018</w:t>
-      </w:r>
-      <w:r>
-        <w:rPr>
-          <w:b/>
-          <w:sz w:val="18"/>
-          <w:szCs w:val="20"/>
-        </w:rPr>
-        <w:t xml:space="preserve"> – </w:t>
-      </w:r>
-      <w:r>
-        <w:rPr>
-          <w:b/>
-          <w:sz w:val="18"/>
-          <w:szCs w:val="20"/>
-        </w:rPr>
-        <w:t>Aug, 2024</w:t>
-      </w:r>
-      <w:r>
-        <w:rPr>
-          <w:b/>
-          <w:i/>
-          <w:iCs/>
-          <w:sz w:val="18"/>
-          <w:szCs w:val="20"/>
-        </w:rPr>
-        <w:br/>
-      </w:r>
-      <w:r>
-        <w:rPr>
-          <w:sz w:val="18"/>
-          <w:szCs w:val="20"/>
-        </w:rPr>
-        <w:t>IPK: 3.2</w:t>
-      </w:r>
-    </w:p>
-    <w:p>
-      <w:pPr>
-        <w:spacing w:line="240" w:lineRule="auto"/>
-        <w:ind w:left="-851" w:right="-897"/>
-        <w:jc w:val="both"/>
-        <w:rPr>
-          <w:sz w:val="18"/>
-          <w:szCs w:val="20"/>
-        </w:rPr>
-      </w:pPr>
-      <w:proofErr w:type="spellStart"/>
-      <w:r>
-        <w:rPr>
-          <w:sz w:val="18"/>
-          <w:szCs w:val="20"/>
-        </w:rPr>
-        <w:t>Fakultas</w:t>
-      </w:r>
-      <w:proofErr w:type="spellEnd"/>
-      <w:r>
-        <w:rPr>
-          <w:sz w:val="18"/>
-          <w:szCs w:val="20"/>
-        </w:rPr>
-        <w:t xml:space="preserve"> </w:t>
-      </w:r>
-      <w:proofErr w:type="spellStart"/>
-      <w:r>
-        <w:rPr>
-          <w:sz w:val="18"/>
-          <w:szCs w:val="20"/>
-        </w:rPr>
-        <w:t>Hukum</w:t>
-      </w:r>
-      <w:proofErr w:type="spellEnd"/>
-    </w:p>
-    <w:p>
-      <w:pPr>
-        <w:tabs>
-          <w:tab w:val="left" w:pos="1841"/>
-        </w:tabs>
-        <w:spacing w:line="240" w:lineRule="auto"/>
-        <w:ind w:left="-851" w:right="-897"/>
-        <w:rPr>
-          <w:i/>
-          <w:iCs/>
-          <w:sz w:val="18"/>
-          <w:szCs w:val="20"/>
-        </w:rPr>
-      </w:pPr>
-      <w:bookmarkStart w:id="1" w:name="_gjdgxs" w:colFirst="0" w:colLast="0"/>
-      <w:bookmarkEnd w:id="1"/>
     </w:p>
     <w:p>
       <w:pPr>
@@ -863,20 +715,20 @@
         <w:spacing w:after="120" w:line="240" w:lineRule="auto"/>
         <w:ind w:left="-851" w:right="-897"/>
         <w:rPr>
-          <w:i/>
-          <w:iCs/>
-          <w:sz w:val="18"/>
-          <w:szCs w:val="20"/>
-        </w:rPr>
-      </w:pPr>
-      <w:r>
-        <w:rPr>
-          <w:b/>
-          <w:bCs/>
-          <w:sz w:val="18"/>
-          <w:szCs w:val="20"/>
-        </w:rPr>
-        <w:t>Project Experiences</w:t>
+          <w:b/>
+          <w:bCs/>
+          <w:sz w:val="18"/>
+          <w:szCs w:val="20"/>
+        </w:rPr>
+      </w:pPr>
+      <w:r>
+        <w:rPr>
+          <w:b/>
+          <w:bCs/>
+          <w:sz w:val="18"/>
+          <w:szCs w:val="20"/>
+        </w:rPr>
+        <w:t>Working Experiences</w:t>
       </w:r>
     </w:p>
     <w:p>
@@ -1060,20 +912,40 @@
     <w:p>
       <w:pPr>
         <w:tabs>
-          <w:tab w:val="left" w:pos="8222"/>
-          <w:tab w:val="left" w:pos="9356"/>
-          <w:tab w:val="right" w:pos="10206"/>
+          <w:tab w:val="left" w:pos="10206"/>
         </w:tabs>
-        <w:spacing w:before="60" w:line="240" w:lineRule="auto"/>
-        <w:ind w:left="-851" w:right="-846"/>
+        <w:spacing w:line="240" w:lineRule="auto"/>
+        <w:ind w:left="-851" w:right="-896"/>
         <w:jc w:val="both"/>
         <w:rPr>
-          <w:b/>
-          <w:bCs/>
-          <w:sz w:val="18"/>
-          <w:szCs w:val="20"/>
-        </w:rPr>
-      </w:pPr>
+          <w:sz w:val="18"/>
+          <w:szCs w:val="20"/>
+        </w:rPr>
+      </w:pPr>
+    </w:p>
+    <w:p>
+      <w:pPr>
+        <w:pBdr>
+          <w:bottom w:val="single" w:sz="4" w:space="1" w:color="000000"/>
+        </w:pBdr>
+        <w:spacing w:after="120" w:line="240" w:lineRule="auto"/>
+        <w:ind w:left="-851" w:right="-897"/>
+        <w:rPr>
+          <w:i/>
+          <w:iCs/>
+          <w:sz w:val="18"/>
+          <w:szCs w:val="20"/>
+        </w:rPr>
+      </w:pPr>
+      <w:r>
+        <w:rPr>
+          <w:b/>
+          <w:bCs/>
+          <w:sz w:val="18"/>
+          <w:szCs w:val="20"/>
+        </w:rPr>
+        <w:t>Project Experiences</w:t>
+      </w:r>
     </w:p>
     <w:p>
       <w:pPr>
@@ -1618,21 +1490,11 @@
     </w:p>
     <w:p>
       <w:pPr>
-        <w:widowControl w:val="0"/>
+        <w:tabs>
+          <w:tab w:val="left" w:pos="10206"/>
+        </w:tabs>
         <w:spacing w:line="240" w:lineRule="auto"/>
-        <w:ind w:left="-851" w:right="-897"/>
-        <w:jc w:val="both"/>
-        <w:rPr>
-          <w:sz w:val="18"/>
-          <w:szCs w:val="20"/>
-        </w:rPr>
-      </w:pPr>
-    </w:p>
-    <w:p>
-      <w:pPr>
-        <w:widowControl w:val="0"/>
-        <w:spacing w:line="240" w:lineRule="auto"/>
-        <w:ind w:right="-897"/>
+        <w:ind w:left="-851" w:right="-896"/>
         <w:jc w:val="both"/>
         <w:rPr>
           <w:sz w:val="18"/>
@@ -1648,484 +1510,658 @@
         <w:spacing w:after="120" w:line="240" w:lineRule="auto"/>
         <w:ind w:left="-851" w:right="-897"/>
         <w:rPr>
-          <w:sz w:val="18"/>
-          <w:szCs w:val="20"/>
-        </w:rPr>
-      </w:pPr>
-      <w:r>
-        <w:rPr>
-          <w:b/>
-          <w:bCs/>
-          <w:sz w:val="18"/>
-          <w:szCs w:val="20"/>
-        </w:rPr>
-        <w:t>Additional Information</w:t>
+          <w:b/>
+          <w:bCs/>
+          <w:sz w:val="18"/>
+          <w:szCs w:val="20"/>
+        </w:rPr>
+      </w:pPr>
+      <w:r>
+        <w:rPr>
+          <w:b/>
+          <w:bCs/>
+          <w:sz w:val="18"/>
+          <w:szCs w:val="20"/>
+        </w:rPr>
+        <w:t>Education</w:t>
       </w:r>
     </w:p>
     <w:p>
       <w:pPr>
-        <w:widowControl w:val="0"/>
-        <w:spacing w:line="240" w:lineRule="auto"/>
-        <w:ind w:left="-851" w:right="-897"/>
-        <w:jc w:val="both"/>
-        <w:rPr>
-          <w:b/>
-          <w:bCs/>
-          <w:sz w:val="18"/>
-          <w:szCs w:val="20"/>
-        </w:rPr>
-      </w:pPr>
-      <w:r>
-        <w:rPr>
-          <w:b/>
-          <w:bCs/>
-          <w:sz w:val="18"/>
-          <w:szCs w:val="20"/>
-        </w:rPr>
-        <w:t>Technical</w:t>
-      </w:r>
-      <w:r>
-        <w:rPr>
-          <w:b/>
-          <w:bCs/>
-          <w:sz w:val="18"/>
-          <w:szCs w:val="20"/>
-        </w:rPr>
-        <w:t xml:space="preserve"> Skill</w:t>
-      </w:r>
-      <w:r>
-        <w:rPr>
-          <w:b/>
-          <w:bCs/>
-          <w:sz w:val="18"/>
-          <w:szCs w:val="20"/>
-        </w:rPr>
-        <w:t>:</w:t>
-      </w:r>
-    </w:p>
-    <w:p>
-      <w:pPr>
-        <w:pStyle w:val="ListParagraph"/>
-        <w:widowControl w:val="0"/>
-        <w:numPr>
-          <w:ilvl w:val="0"/>
-          <w:numId w:val="6"/>
-        </w:numPr>
-        <w:spacing w:line="240" w:lineRule="auto"/>
-        <w:ind w:left="-567" w:right="-897" w:hanging="284"/>
-        <w:jc w:val="both"/>
-        <w:rPr>
-          <w:bCs/>
-          <w:sz w:val="18"/>
-          <w:szCs w:val="20"/>
-        </w:rPr>
-      </w:pPr>
-      <w:r>
-        <w:rPr>
-          <w:b/>
-          <w:bCs/>
-          <w:sz w:val="18"/>
-          <w:szCs w:val="20"/>
-        </w:rPr>
-        <w:t xml:space="preserve">Programming Languages: </w:t>
-      </w:r>
-      <w:r>
-        <w:rPr>
-          <w:bCs/>
-          <w:sz w:val="18"/>
-          <w:szCs w:val="20"/>
-        </w:rPr>
-        <w:t>JavaScript</w:t>
-      </w:r>
-      <w:r>
-        <w:rPr>
-          <w:bCs/>
-          <w:sz w:val="18"/>
-          <w:szCs w:val="20"/>
-        </w:rPr>
-        <w:t xml:space="preserve">, </w:t>
-      </w:r>
-      <w:proofErr w:type="spellStart"/>
-      <w:r>
-        <w:rPr>
-          <w:bCs/>
-          <w:sz w:val="18"/>
-          <w:szCs w:val="20"/>
-        </w:rPr>
-        <w:t>TypeScript</w:t>
-      </w:r>
-      <w:proofErr w:type="spellEnd"/>
-    </w:p>
-    <w:p>
-      <w:pPr>
-        <w:pStyle w:val="ListParagraph"/>
-        <w:widowControl w:val="0"/>
-        <w:numPr>
-          <w:ilvl w:val="0"/>
-          <w:numId w:val="6"/>
-        </w:numPr>
-        <w:spacing w:line="240" w:lineRule="auto"/>
-        <w:ind w:left="-567" w:right="-897" w:hanging="284"/>
-        <w:jc w:val="both"/>
-        <w:rPr>
-          <w:bCs/>
-          <w:sz w:val="18"/>
-          <w:szCs w:val="20"/>
-        </w:rPr>
-      </w:pPr>
-      <w:r>
-        <w:rPr>
-          <w:b/>
-          <w:bCs/>
-          <w:sz w:val="18"/>
-          <w:szCs w:val="20"/>
-        </w:rPr>
-        <w:t>Frontend Frameworks</w:t>
-      </w:r>
-      <w:r>
-        <w:rPr>
-          <w:b/>
-          <w:bCs/>
-          <w:sz w:val="18"/>
-          <w:szCs w:val="20"/>
-        </w:rPr>
-        <w:t>/Tool</w:t>
-      </w:r>
-      <w:r>
-        <w:rPr>
-          <w:b/>
-          <w:bCs/>
-          <w:sz w:val="18"/>
-          <w:szCs w:val="20"/>
-        </w:rPr>
-        <w:t xml:space="preserve">: </w:t>
-      </w:r>
-      <w:r>
-        <w:rPr>
-          <w:bCs/>
-          <w:sz w:val="18"/>
-          <w:szCs w:val="20"/>
-        </w:rPr>
-        <w:t>React, Next.js</w:t>
-      </w:r>
-      <w:r>
-        <w:rPr>
-          <w:bCs/>
-          <w:sz w:val="18"/>
-          <w:szCs w:val="20"/>
-        </w:rPr>
-        <w:t xml:space="preserve">, </w:t>
-      </w:r>
-      <w:proofErr w:type="spellStart"/>
-      <w:r>
-        <w:rPr>
-          <w:bCs/>
-          <w:sz w:val="18"/>
-          <w:szCs w:val="20"/>
-        </w:rPr>
-        <w:t>Vite</w:t>
-      </w:r>
-      <w:proofErr w:type="spellEnd"/>
-    </w:p>
-    <w:p>
-      <w:pPr>
-        <w:pStyle w:val="ListParagraph"/>
-        <w:widowControl w:val="0"/>
-        <w:numPr>
-          <w:ilvl w:val="0"/>
-          <w:numId w:val="6"/>
-        </w:numPr>
-        <w:spacing w:line="240" w:lineRule="auto"/>
-        <w:ind w:left="-567" w:right="-897" w:hanging="284"/>
-        <w:jc w:val="both"/>
-        <w:rPr>
-          <w:sz w:val="18"/>
-          <w:szCs w:val="20"/>
-        </w:rPr>
-      </w:pPr>
-      <w:r>
-        <w:rPr>
-          <w:b/>
-          <w:bCs/>
-          <w:sz w:val="18"/>
-          <w:szCs w:val="20"/>
-        </w:rPr>
-        <w:t xml:space="preserve">Backend Framework: </w:t>
-      </w:r>
-      <w:proofErr w:type="spellStart"/>
-      <w:r>
-        <w:rPr>
-          <w:sz w:val="18"/>
-          <w:szCs w:val="20"/>
-        </w:rPr>
-        <w:t>NestJs</w:t>
-      </w:r>
-      <w:proofErr w:type="spellEnd"/>
-    </w:p>
-    <w:p>
-      <w:pPr>
-        <w:pStyle w:val="ListParagraph"/>
-        <w:widowControl w:val="0"/>
-        <w:numPr>
-          <w:ilvl w:val="0"/>
-          <w:numId w:val="6"/>
-        </w:numPr>
-        <w:spacing w:line="240" w:lineRule="auto"/>
-        <w:ind w:left="-567" w:right="-897" w:hanging="284"/>
-        <w:jc w:val="both"/>
-        <w:rPr>
-          <w:b/>
-          <w:bCs/>
-          <w:sz w:val="18"/>
-          <w:szCs w:val="20"/>
-        </w:rPr>
-      </w:pPr>
-      <w:r>
-        <w:rPr>
-          <w:b/>
-          <w:bCs/>
-          <w:sz w:val="18"/>
-          <w:szCs w:val="20"/>
-        </w:rPr>
-        <w:t xml:space="preserve">Database Management: </w:t>
-      </w:r>
-      <w:proofErr w:type="spellStart"/>
-      <w:r>
-        <w:rPr>
-          <w:bCs/>
-          <w:sz w:val="18"/>
-          <w:szCs w:val="20"/>
-        </w:rPr>
-        <w:t>PostgreSQL</w:t>
-      </w:r>
-      <w:proofErr w:type="spellEnd"/>
-      <w:r>
-        <w:rPr>
-          <w:bCs/>
-          <w:sz w:val="18"/>
-          <w:szCs w:val="20"/>
-        </w:rPr>
-        <w:t xml:space="preserve">, </w:t>
-      </w:r>
-      <w:proofErr w:type="spellStart"/>
-      <w:r>
-        <w:rPr>
-          <w:bCs/>
-          <w:sz w:val="18"/>
-          <w:szCs w:val="20"/>
-        </w:rPr>
-        <w:t>Prisma</w:t>
-      </w:r>
-      <w:proofErr w:type="spellEnd"/>
-    </w:p>
-    <w:p>
-      <w:pPr>
-        <w:widowControl w:val="0"/>
-        <w:spacing w:line="240" w:lineRule="auto"/>
-        <w:ind w:left="-851" w:right="-897"/>
-        <w:jc w:val="both"/>
-        <w:rPr>
-          <w:b/>
-          <w:bCs/>
-          <w:sz w:val="18"/>
-          <w:szCs w:val="20"/>
-        </w:rPr>
-      </w:pPr>
-    </w:p>
-    <w:p>
-      <w:pPr>
-        <w:widowControl w:val="0"/>
-        <w:spacing w:line="240" w:lineRule="auto"/>
-        <w:ind w:left="-851" w:right="-897"/>
-        <w:jc w:val="both"/>
-        <w:rPr>
-          <w:sz w:val="18"/>
-          <w:szCs w:val="20"/>
-        </w:rPr>
-      </w:pPr>
-      <w:r>
-        <w:rPr>
-          <w:b/>
-          <w:bCs/>
-          <w:sz w:val="18"/>
-          <w:szCs w:val="20"/>
-        </w:rPr>
-        <w:t>Soft Skills:</w:t>
-      </w:r>
-      <w:r>
-        <w:rPr>
-          <w:sz w:val="18"/>
-          <w:szCs w:val="20"/>
-        </w:rPr>
-        <w:t xml:space="preserve"> Problem-Solving, Communication, </w:t>
-      </w:r>
-      <w:r>
-        <w:rPr>
-          <w:sz w:val="18"/>
-          <w:szCs w:val="20"/>
-        </w:rPr>
-        <w:t>Adaptability</w:t>
-      </w:r>
-    </w:p>
-    <w:p>
-      <w:pPr>
-        <w:widowControl w:val="0"/>
-        <w:tabs>
-          <w:tab w:val="left" w:pos="4830"/>
-        </w:tabs>
-        <w:spacing w:line="240" w:lineRule="auto"/>
-        <w:ind w:left="-131" w:right="-897" w:firstLine="851"/>
-        <w:jc w:val="both"/>
-        <w:rPr>
-          <w:sz w:val="18"/>
-          <w:szCs w:val="20"/>
-        </w:rPr>
-      </w:pPr>
-      <w:r>
-        <w:rPr>
-          <w:sz w:val="18"/>
-          <w:szCs w:val="20"/>
-        </w:rPr>
-        <w:tab/>
-      </w:r>
-    </w:p>
-    <w:p>
-      <w:pPr>
-        <w:widowControl w:val="0"/>
-        <w:spacing w:line="240" w:lineRule="auto"/>
-        <w:ind w:left="-851" w:right="-1080"/>
-        <w:jc w:val="both"/>
-        <w:rPr>
-          <w:b/>
-          <w:bCs/>
-          <w:sz w:val="18"/>
-          <w:szCs w:val="20"/>
-        </w:rPr>
-      </w:pPr>
-      <w:r>
-        <w:rPr>
-          <w:b/>
-          <w:bCs/>
-          <w:sz w:val="18"/>
-          <w:szCs w:val="20"/>
-        </w:rPr>
-        <w:lastRenderedPageBreak/>
-        <w:t xml:space="preserve">Certification: </w:t>
-      </w:r>
-    </w:p>
-    <w:p>
-      <w:pPr>
-        <w:widowControl w:val="0"/>
         <w:tabs>
           <w:tab w:val="right" w:pos="10206"/>
         </w:tabs>
         <w:spacing w:line="240" w:lineRule="auto"/>
-        <w:ind w:left="-851" w:right="-845"/>
+        <w:ind w:left="-851" w:right="-896"/>
         <w:jc w:val="both"/>
         <w:rPr>
-          <w:sz w:val="21"/>
-        </w:rPr>
-      </w:pPr>
-      <w:r>
-        <w:rPr>
-          <w:sz w:val="18"/>
-          <w:szCs w:val="20"/>
-        </w:rPr>
-        <w:t>1</w:t>
-      </w:r>
-      <w:r>
-        <w:rPr>
-          <w:b/>
-          <w:bCs/>
-          <w:sz w:val="18"/>
-          <w:szCs w:val="20"/>
-        </w:rPr>
-        <w:t xml:space="preserve">. </w:t>
-      </w:r>
-      <w:hyperlink r:id="rId9" w:history="1">
-        <w:r>
-          <w:rPr>
-            <w:rStyle w:val="Hyperlink"/>
-            <w:sz w:val="18"/>
-            <w:szCs w:val="20"/>
-          </w:rPr>
-          <w:t>Certificate of Achievement</w:t>
-        </w:r>
-        <w:r>
-          <w:rPr>
-            <w:rStyle w:val="Hyperlink"/>
-            <w:sz w:val="18"/>
-            <w:szCs w:val="20"/>
-          </w:rPr>
-          <w:t>,</w:t>
-        </w:r>
-        <w:r>
-          <w:rPr>
-            <w:rStyle w:val="Hyperlink"/>
-            <w:sz w:val="18"/>
-            <w:szCs w:val="20"/>
-          </w:rPr>
-          <w:t xml:space="preserve"> </w:t>
-        </w:r>
-        <w:proofErr w:type="spellStart"/>
-        <w:r>
-          <w:rPr>
-            <w:rStyle w:val="Hyperlink"/>
-            <w:sz w:val="18"/>
-            <w:szCs w:val="20"/>
-          </w:rPr>
-          <w:t>RevoU</w:t>
-        </w:r>
-        <w:proofErr w:type="spellEnd"/>
-        <w:r>
-          <w:rPr>
-            <w:rStyle w:val="Hyperlink"/>
-            <w:sz w:val="18"/>
-            <w:szCs w:val="20"/>
-          </w:rPr>
-          <w:t xml:space="preserve"> </w:t>
-        </w:r>
-        <w:proofErr w:type="spellStart"/>
-        <w:r>
-          <w:rPr>
-            <w:rStyle w:val="Hyperlink"/>
-            <w:sz w:val="18"/>
-            <w:szCs w:val="20"/>
-          </w:rPr>
-          <w:t>Fullstack</w:t>
-        </w:r>
-        <w:proofErr w:type="spellEnd"/>
-        <w:r>
-          <w:rPr>
-            <w:rStyle w:val="Hyperlink"/>
-            <w:sz w:val="18"/>
-            <w:szCs w:val="20"/>
-          </w:rPr>
-          <w:t xml:space="preserve"> Software Engineer</w:t>
-        </w:r>
-      </w:hyperlink>
-      <w:r>
-        <w:rPr>
+          <w:sz w:val="18"/>
+          <w:szCs w:val="20"/>
+        </w:rPr>
+      </w:pPr>
+      <w:proofErr w:type="spellStart"/>
+      <w:r>
+        <w:rPr>
+          <w:b/>
+          <w:bCs/>
+          <w:sz w:val="18"/>
+          <w:szCs w:val="20"/>
+        </w:rPr>
+        <w:t>RevoU</w:t>
+      </w:r>
+      <w:proofErr w:type="spellEnd"/>
+      <w:r>
+        <w:rPr>
+          <w:b/>
+          <w:bCs/>
+          <w:sz w:val="18"/>
+          <w:szCs w:val="20"/>
+        </w:rPr>
+        <w:t xml:space="preserve"> </w:t>
+      </w:r>
+      <w:r>
+        <w:rPr>
+          <w:b/>
+          <w:sz w:val="18"/>
+          <w:szCs w:val="20"/>
+        </w:rPr>
+        <w:t>Full-stack Software Engineering</w:t>
+      </w:r>
+      <w:r>
+        <w:rPr>
+          <w:b/>
           <w:sz w:val="18"/>
           <w:szCs w:val="20"/>
         </w:rPr>
         <w:tab/>
-      </w:r>
-      <w:r>
-        <w:rPr>
-          <w:b/>
-          <w:sz w:val="18"/>
-          <w:szCs w:val="20"/>
-        </w:rPr>
-        <w:t>Feb, 6</w:t>
-      </w:r>
-      <w:r>
-        <w:rPr>
-          <w:b/>
-          <w:sz w:val="18"/>
-          <w:szCs w:val="20"/>
-        </w:rPr>
-        <w:t xml:space="preserve"> 2026</w:t>
+        <w:t>July, 2025 – Jan, 2026</w:t>
+      </w:r>
+      <w:r>
+        <w:rPr>
+          <w:b/>
+          <w:i/>
+          <w:iCs/>
+          <w:sz w:val="18"/>
+          <w:szCs w:val="20"/>
+        </w:rPr>
+        <w:br/>
+      </w:r>
+      <w:proofErr w:type="gramStart"/>
+      <w:r>
+        <w:rPr>
+          <w:sz w:val="18"/>
+          <w:szCs w:val="20"/>
+        </w:rPr>
+        <w:t>Completed</w:t>
+      </w:r>
+      <w:proofErr w:type="gramEnd"/>
+      <w:r>
+        <w:rPr>
+          <w:sz w:val="18"/>
+          <w:szCs w:val="20"/>
+        </w:rPr>
+        <w:t xml:space="preserve"> an intensive 29-week Full-Stack Software Engineering </w:t>
+      </w:r>
+      <w:proofErr w:type="spellStart"/>
+      <w:r>
+        <w:rPr>
+          <w:sz w:val="18"/>
+          <w:szCs w:val="20"/>
+        </w:rPr>
+        <w:t>bootcamp</w:t>
+      </w:r>
+      <w:proofErr w:type="spellEnd"/>
+      <w:r>
+        <w:rPr>
+          <w:sz w:val="18"/>
+          <w:szCs w:val="20"/>
+        </w:rPr>
+        <w:t xml:space="preserve"> covering frontend, backend, and </w:t>
+      </w:r>
+      <w:proofErr w:type="spellStart"/>
+      <w:r>
+        <w:rPr>
+          <w:sz w:val="18"/>
+          <w:szCs w:val="20"/>
+        </w:rPr>
+        <w:t>fullstack</w:t>
+      </w:r>
+      <w:proofErr w:type="spellEnd"/>
+      <w:r>
+        <w:rPr>
+          <w:sz w:val="18"/>
+          <w:szCs w:val="20"/>
+        </w:rPr>
+        <w:t xml:space="preserve"> development through hands-on projects</w:t>
+      </w:r>
+    </w:p>
+    <w:p>
+      <w:pPr>
+        <w:tabs>
+          <w:tab w:val="left" w:pos="8476"/>
+        </w:tabs>
+        <w:spacing w:line="240" w:lineRule="auto"/>
+        <w:ind w:left="-851" w:right="-897"/>
+        <w:jc w:val="both"/>
+        <w:rPr>
+          <w:b/>
+          <w:sz w:val="18"/>
+          <w:szCs w:val="20"/>
+        </w:rPr>
+      </w:pPr>
+      <w:r>
+        <w:rPr>
+          <w:b/>
+          <w:sz w:val="18"/>
+          <w:szCs w:val="20"/>
+        </w:rPr>
+        <w:t xml:space="preserve">Final Project: </w:t>
+      </w:r>
+      <w:proofErr w:type="spellStart"/>
+      <w:r>
+        <w:rPr>
+          <w:b/>
+          <w:bCs/>
+          <w:sz w:val="18"/>
+          <w:szCs w:val="20"/>
+        </w:rPr>
+        <w:t>TiBooth</w:t>
+      </w:r>
+      <w:proofErr w:type="spellEnd"/>
+      <w:r>
+        <w:rPr>
+          <w:b/>
+          <w:bCs/>
+          <w:sz w:val="18"/>
+          <w:szCs w:val="20"/>
+        </w:rPr>
+        <w:t xml:space="preserve"> Movie Ticketing Website</w:t>
+      </w:r>
+    </w:p>
+    <w:p>
+      <w:pPr>
+        <w:tabs>
+          <w:tab w:val="left" w:pos="8476"/>
+        </w:tabs>
+        <w:spacing w:line="240" w:lineRule="auto"/>
+        <w:ind w:left="-851" w:right="-897"/>
+        <w:jc w:val="both"/>
+        <w:rPr>
+          <w:b/>
+          <w:sz w:val="18"/>
+          <w:szCs w:val="20"/>
+        </w:rPr>
+      </w:pPr>
+      <w:r>
+        <w:rPr>
+          <w:sz w:val="18"/>
+          <w:szCs w:val="20"/>
+        </w:rPr>
+        <w:t xml:space="preserve">This project is a </w:t>
+      </w:r>
+      <w:proofErr w:type="spellStart"/>
+      <w:r>
+        <w:rPr>
+          <w:sz w:val="18"/>
+          <w:szCs w:val="20"/>
+        </w:rPr>
+        <w:t>fullstack</w:t>
+      </w:r>
+      <w:proofErr w:type="spellEnd"/>
+      <w:r>
+        <w:rPr>
+          <w:sz w:val="18"/>
+          <w:szCs w:val="20"/>
+        </w:rPr>
+        <w:t xml:space="preserve"> movie ticket booking web application that provides a seamless reservation experience through an integrated frontend and backend system. The platform allows users to browse movie catalogs, view real-time theater schedules, select seats, and manage bookings through a dynamic user interface.</w:t>
+      </w:r>
+      <w:r>
+        <w:rPr>
+          <w:b/>
+          <w:sz w:val="18"/>
+          <w:szCs w:val="20"/>
+        </w:rPr>
+        <w:t xml:space="preserve"> </w:t>
+      </w:r>
+    </w:p>
+    <w:p>
+      <w:pPr>
+        <w:tabs>
+          <w:tab w:val="left" w:pos="8476"/>
+        </w:tabs>
+        <w:spacing w:line="240" w:lineRule="auto"/>
+        <w:ind w:left="-851" w:right="-897"/>
+        <w:jc w:val="both"/>
+        <w:rPr>
+          <w:b/>
+          <w:sz w:val="18"/>
+          <w:szCs w:val="20"/>
+        </w:rPr>
+      </w:pPr>
+    </w:p>
+    <w:p>
+      <w:pPr>
+        <w:tabs>
+          <w:tab w:val="right" w:pos="10206"/>
+        </w:tabs>
+        <w:spacing w:line="240" w:lineRule="auto"/>
+        <w:ind w:left="-851" w:right="-896"/>
+        <w:jc w:val="both"/>
+        <w:rPr>
+          <w:sz w:val="18"/>
+          <w:szCs w:val="20"/>
+        </w:rPr>
+      </w:pPr>
+      <w:proofErr w:type="spellStart"/>
+      <w:r>
+        <w:rPr>
+          <w:b/>
+          <w:bCs/>
+          <w:sz w:val="18"/>
+          <w:szCs w:val="20"/>
+        </w:rPr>
+        <w:t>Universitas</w:t>
+      </w:r>
+      <w:proofErr w:type="spellEnd"/>
+      <w:r>
+        <w:rPr>
+          <w:b/>
+          <w:bCs/>
+          <w:sz w:val="18"/>
+          <w:szCs w:val="20"/>
+        </w:rPr>
+        <w:t xml:space="preserve"> Surabaya</w:t>
+      </w:r>
+      <w:r>
+        <w:rPr>
+          <w:b/>
+          <w:sz w:val="18"/>
+          <w:szCs w:val="20"/>
+        </w:rPr>
+        <w:t xml:space="preserve"> </w:t>
+      </w:r>
+      <w:r>
+        <w:rPr>
+          <w:b/>
+          <w:sz w:val="18"/>
+          <w:szCs w:val="20"/>
+        </w:rPr>
+        <w:tab/>
+      </w:r>
+      <w:r>
+        <w:rPr>
+          <w:b/>
+          <w:sz w:val="18"/>
+          <w:szCs w:val="20"/>
+        </w:rPr>
+        <w:t>July</w:t>
+      </w:r>
+      <w:r>
+        <w:rPr>
+          <w:b/>
+          <w:sz w:val="18"/>
+          <w:szCs w:val="20"/>
+        </w:rPr>
+        <w:t xml:space="preserve">, </w:t>
+      </w:r>
+      <w:r>
+        <w:rPr>
+          <w:b/>
+          <w:sz w:val="18"/>
+          <w:szCs w:val="20"/>
+        </w:rPr>
+        <w:t>2018</w:t>
+      </w:r>
+      <w:r>
+        <w:rPr>
+          <w:b/>
+          <w:sz w:val="18"/>
+          <w:szCs w:val="20"/>
+        </w:rPr>
+        <w:t xml:space="preserve"> – </w:t>
+      </w:r>
+      <w:r>
+        <w:rPr>
+          <w:b/>
+          <w:sz w:val="18"/>
+          <w:szCs w:val="20"/>
+        </w:rPr>
+        <w:t>Aug, 2024</w:t>
+      </w:r>
+      <w:r>
+        <w:rPr>
+          <w:b/>
+          <w:i/>
+          <w:iCs/>
+          <w:sz w:val="18"/>
+          <w:szCs w:val="20"/>
+        </w:rPr>
+        <w:br/>
+      </w:r>
+      <w:r>
+        <w:rPr>
+          <w:sz w:val="18"/>
+          <w:szCs w:val="20"/>
+        </w:rPr>
+        <w:t>IPK: 3.2</w:t>
+      </w:r>
+    </w:p>
+    <w:p>
+      <w:pPr>
+        <w:spacing w:line="240" w:lineRule="auto"/>
+        <w:ind w:left="-851" w:right="-897"/>
+        <w:jc w:val="both"/>
+        <w:rPr>
+          <w:sz w:val="18"/>
+          <w:szCs w:val="20"/>
+        </w:rPr>
+      </w:pPr>
+      <w:proofErr w:type="spellStart"/>
+      <w:r>
+        <w:rPr>
+          <w:sz w:val="18"/>
+          <w:szCs w:val="20"/>
+        </w:rPr>
+        <w:t>Fakultas</w:t>
+      </w:r>
+      <w:proofErr w:type="spellEnd"/>
+      <w:r>
+        <w:rPr>
+          <w:sz w:val="18"/>
+          <w:szCs w:val="20"/>
+        </w:rPr>
+        <w:t xml:space="preserve"> </w:t>
+      </w:r>
+      <w:proofErr w:type="spellStart"/>
+      <w:r>
+        <w:rPr>
+          <w:sz w:val="18"/>
+          <w:szCs w:val="20"/>
+        </w:rPr>
+        <w:t>Hukum</w:t>
+      </w:r>
+      <w:proofErr w:type="spellEnd"/>
+    </w:p>
+    <w:p>
+      <w:pPr>
+        <w:tabs>
+          <w:tab w:val="left" w:pos="10206"/>
+        </w:tabs>
+        <w:spacing w:line="240" w:lineRule="auto"/>
+        <w:ind w:left="-851" w:right="-896"/>
+        <w:jc w:val="both"/>
+        <w:rPr>
+          <w:sz w:val="18"/>
+          <w:szCs w:val="20"/>
+        </w:rPr>
+      </w:pPr>
+    </w:p>
+    <w:p>
+      <w:pPr>
+        <w:tabs>
+          <w:tab w:val="left" w:pos="10206"/>
+        </w:tabs>
+        <w:spacing w:line="240" w:lineRule="auto"/>
+        <w:ind w:left="-851" w:right="-896"/>
+        <w:jc w:val="both"/>
+        <w:rPr>
+          <w:sz w:val="18"/>
+          <w:szCs w:val="20"/>
+        </w:rPr>
+      </w:pPr>
+    </w:p>
+    <w:p>
+      <w:pPr>
+        <w:tabs>
+          <w:tab w:val="left" w:pos="10206"/>
+        </w:tabs>
+        <w:spacing w:line="240" w:lineRule="auto"/>
+        <w:ind w:left="-851" w:right="-896"/>
+        <w:jc w:val="both"/>
+        <w:rPr>
+          <w:sz w:val="18"/>
+          <w:szCs w:val="20"/>
+        </w:rPr>
+      </w:pPr>
+    </w:p>
+    <w:p>
+      <w:pPr>
+        <w:widowControl w:val="0"/>
+        <w:pBdr>
+          <w:bottom w:val="single" w:sz="4" w:space="1" w:color="auto"/>
+        </w:pBdr>
+        <w:spacing w:line="240" w:lineRule="auto"/>
+        <w:ind w:left="-851" w:right="-1080"/>
+        <w:jc w:val="both"/>
+        <w:rPr>
+          <w:b/>
+          <w:bCs/>
+          <w:sz w:val="18"/>
+          <w:szCs w:val="20"/>
+        </w:rPr>
+      </w:pPr>
+      <w:r>
+        <w:rPr>
+          <w:b/>
+          <w:bCs/>
+          <w:sz w:val="18"/>
+          <w:szCs w:val="20"/>
+        </w:rPr>
+        <w:t xml:space="preserve">Certification: </w:t>
+      </w:r>
+    </w:p>
+    <w:bookmarkStart w:id="1" w:name="_gjdgxs" w:colFirst="0" w:colLast="0"/>
+    <w:bookmarkEnd w:id="1"/>
+    <w:p>
+      <w:pPr>
+        <w:pStyle w:val="ListParagraph"/>
+        <w:numPr>
+          <w:ilvl w:val="0"/>
+          <w:numId w:val="7"/>
+        </w:numPr>
+        <w:tabs>
+          <w:tab w:val="right" w:pos="10206"/>
+        </w:tabs>
+        <w:spacing w:line="240" w:lineRule="auto"/>
+        <w:ind w:left="-426" w:right="-896" w:hanging="425"/>
+        <w:jc w:val="both"/>
+        <w:rPr>
+          <w:sz w:val="18"/>
+          <w:szCs w:val="20"/>
+        </w:rPr>
+      </w:pPr>
+      <w:r>
+        <w:rPr>
+          <w:b/>
+          <w:bCs/>
+          <w:sz w:val="18"/>
+          <w:szCs w:val="20"/>
+        </w:rPr>
+        <w:fldChar w:fldCharType="begin"/>
+      </w:r>
+      <w:r>
+        <w:rPr>
+          <w:b/>
+          <w:bCs/>
+          <w:sz w:val="18"/>
+          <w:szCs w:val="20"/>
+        </w:rPr>
+        <w:instrText xml:space="preserve"> HYPERLINK "https://drive.google.com/file/d/1EwD8dfEeQK861Wz2kGuK3efYP6vljGTG/view?usp=sharing" </w:instrText>
+      </w:r>
+      <w:r>
+        <w:rPr>
+          <w:b/>
+          <w:bCs/>
+          <w:sz w:val="18"/>
+          <w:szCs w:val="20"/>
+        </w:rPr>
+      </w:r>
+      <w:r>
+        <w:rPr>
+          <w:b/>
+          <w:bCs/>
+          <w:sz w:val="18"/>
+          <w:szCs w:val="20"/>
+        </w:rPr>
+        <w:fldChar w:fldCharType="separate"/>
+      </w:r>
+      <w:r>
+        <w:rPr>
+          <w:rStyle w:val="Hyperlink"/>
+          <w:b/>
+          <w:bCs/>
+          <w:sz w:val="18"/>
+          <w:szCs w:val="20"/>
+        </w:rPr>
+        <w:t>Full stack Software Engineer</w:t>
+      </w:r>
+      <w:r>
+        <w:rPr>
+          <w:b/>
+          <w:bCs/>
+          <w:sz w:val="18"/>
+          <w:szCs w:val="20"/>
+        </w:rPr>
+        <w:fldChar w:fldCharType="end"/>
+      </w:r>
+      <w:r>
+        <w:rPr>
+          <w:b/>
+          <w:sz w:val="18"/>
+          <w:szCs w:val="20"/>
+        </w:rPr>
+        <w:t xml:space="preserve"> </w:t>
+      </w:r>
+      <w:r>
+        <w:rPr>
+          <w:b/>
+          <w:sz w:val="18"/>
+          <w:szCs w:val="20"/>
+        </w:rPr>
+        <w:tab/>
+      </w:r>
+      <w:r>
+        <w:rPr>
+          <w:b/>
+          <w:i/>
+          <w:iCs/>
+          <w:sz w:val="18"/>
+          <w:szCs w:val="20"/>
+        </w:rPr>
+        <w:br/>
+      </w:r>
+      <w:r>
+        <w:rPr>
+          <w:i/>
+          <w:sz w:val="18"/>
+          <w:szCs w:val="20"/>
+        </w:rPr>
+        <w:t>Issued by</w:t>
+      </w:r>
+      <w:r>
+        <w:rPr>
+          <w:sz w:val="18"/>
+          <w:szCs w:val="20"/>
+        </w:rPr>
+        <w:t xml:space="preserve">: </w:t>
+      </w:r>
+      <w:proofErr w:type="spellStart"/>
+      <w:r>
+        <w:rPr>
+          <w:sz w:val="18"/>
+          <w:szCs w:val="20"/>
+        </w:rPr>
+        <w:t>RevoU</w:t>
+      </w:r>
+      <w:proofErr w:type="spellEnd"/>
+    </w:p>
+    <w:p>
+      <w:pPr>
+        <w:pStyle w:val="ListParagraph"/>
+        <w:tabs>
+          <w:tab w:val="right" w:pos="10206"/>
+        </w:tabs>
+        <w:spacing w:line="240" w:lineRule="auto"/>
+        <w:ind w:left="-426" w:right="-896"/>
+        <w:jc w:val="both"/>
+        <w:rPr>
+          <w:bCs/>
+          <w:sz w:val="18"/>
+          <w:szCs w:val="20"/>
+        </w:rPr>
+      </w:pPr>
+      <w:r>
+        <w:rPr>
+          <w:bCs/>
+          <w:i/>
+          <w:sz w:val="18"/>
+          <w:szCs w:val="20"/>
+        </w:rPr>
+        <w:t>Issued Date</w:t>
+      </w:r>
+      <w:r>
+        <w:rPr>
+          <w:bCs/>
+          <w:sz w:val="18"/>
+          <w:szCs w:val="20"/>
+        </w:rPr>
+        <w:t xml:space="preserve">:  </w:t>
+      </w:r>
+      <w:r>
+        <w:rPr>
+          <w:bCs/>
+          <w:sz w:val="18"/>
+          <w:szCs w:val="20"/>
+        </w:rPr>
+        <w:t>06 June 2026</w:t>
+      </w:r>
+    </w:p>
+    <w:p>
+      <w:pPr>
+        <w:pStyle w:val="ListParagraph"/>
+        <w:tabs>
+          <w:tab w:val="right" w:pos="10206"/>
+        </w:tabs>
+        <w:spacing w:line="240" w:lineRule="auto"/>
+        <w:ind w:left="-426" w:right="-896"/>
+        <w:jc w:val="both"/>
+        <w:rPr>
+          <w:bCs/>
+          <w:sz w:val="18"/>
+          <w:szCs w:val="20"/>
+        </w:rPr>
+      </w:pPr>
+      <w:r>
+        <w:rPr>
+          <w:bCs/>
+          <w:i/>
+          <w:sz w:val="18"/>
+          <w:szCs w:val="20"/>
+        </w:rPr>
+        <w:t>Credential ID</w:t>
+      </w:r>
+      <w:r>
+        <w:rPr>
+          <w:bCs/>
+          <w:sz w:val="18"/>
+          <w:szCs w:val="20"/>
+        </w:rPr>
+        <w:t xml:space="preserve">: </w:t>
+      </w:r>
+      <w:r>
+        <w:rPr>
+          <w:bCs/>
+          <w:sz w:val="18"/>
+          <w:szCs w:val="20"/>
+        </w:rPr>
+        <w:t>NSE24-2026-06-001</w:t>
+      </w:r>
+      <w:r>
+        <w:rPr>
+          <w:sz w:val="18"/>
+          <w:szCs w:val="20"/>
+        </w:rPr>
+        <w:tab/>
       </w:r>
     </w:p>
     <w:sectPr>
@@ -2794,6 +2830,92 @@
       </w:pPr>
     </w:lvl>
   </w:abstractNum>
+  <w:abstractNum w:abstractNumId="6">
+    <w:nsid w:val="7E5F5594"/>
+    <w:multiLevelType w:val="hybridMultilevel"/>
+    <w:tmpl w:val="77383C18"/>
+    <w:lvl w:ilvl="0" w:tplc="0409000F">
+      <w:start w:val="1"/>
+      <w:numFmt w:val="decimal"/>
+      <w:lvlText w:val="%1."/>
+      <w:lvlJc w:val="left"/>
+      <w:pPr>
+        <w:ind w:left="360" w:hanging="360"/>
+      </w:pPr>
+    </w:lvl>
+    <w:lvl w:ilvl="1" w:tplc="04090019" w:tentative="1">
+      <w:start w:val="1"/>
+      <w:numFmt w:val="lowerLetter"/>
+      <w:lvlText w:val="%2."/>
+      <w:lvlJc w:val="left"/>
+      <w:pPr>
+        <w:ind w:left="1080" w:hanging="360"/>
+      </w:pPr>
+    </w:lvl>
+    <w:lvl w:ilvl="2" w:tplc="0409001B" w:tentative="1">
+      <w:start w:val="1"/>
+      <w:numFmt w:val="lowerRoman"/>
+      <w:lvlText w:val="%3."/>
+      <w:lvlJc w:val="right"/>
+      <w:pPr>
+        <w:ind w:left="1800" w:hanging="180"/>
+      </w:pPr>
+    </w:lvl>
+    <w:lvl w:ilvl="3" w:tplc="0409000F" w:tentative="1">
+      <w:start w:val="1"/>
+      <w:numFmt w:val="decimal"/>
+      <w:lvlText w:val="%4."/>
+      <w:lvlJc w:val="left"/>
+      <w:pPr>
+        <w:ind w:left="2520" w:hanging="360"/>
+      </w:pPr>
+    </w:lvl>
+    <w:lvl w:ilvl="4" w:tplc="04090019" w:tentative="1">
+      <w:start w:val="1"/>
+      <w:numFmt w:val="lowerLetter"/>
+      <w:lvlText w:val="%5."/>
+      <w:lvlJc w:val="left"/>
+      <w:pPr>
+        <w:ind w:left="3240" w:hanging="360"/>
+      </w:pPr>
+    </w:lvl>
+    <w:lvl w:ilvl="5" w:tplc="0409001B" w:tentative="1">
+      <w:start w:val="1"/>
+      <w:numFmt w:val="lowerRoman"/>
+      <w:lvlText w:val="%6."/>
+      <w:lvlJc w:val="right"/>
+      <w:pPr>
+        <w:ind w:left="3960" w:hanging="180"/>
+      </w:pPr>
+    </w:lvl>
+    <w:lvl w:ilvl="6" w:tplc="0409000F" w:tentative="1">
+      <w:start w:val="1"/>
+      <w:numFmt w:val="decimal"/>
+      <w:lvlText w:val="%7."/>
+      <w:lvlJc w:val="left"/>
+      <w:pPr>
+        <w:ind w:left="4680" w:hanging="360"/>
+      </w:pPr>
+    </w:lvl>
+    <w:lvl w:ilvl="7" w:tplc="04090019" w:tentative="1">
+      <w:start w:val="1"/>
+      <w:numFmt w:val="lowerLetter"/>
+      <w:lvlText w:val="%8."/>
+      <w:lvlJc w:val="left"/>
+      <w:pPr>
+        <w:ind w:left="5400" w:hanging="360"/>
+      </w:pPr>
+    </w:lvl>
+    <w:lvl w:ilvl="8" w:tplc="0409001B" w:tentative="1">
+      <w:start w:val="1"/>
+      <w:numFmt w:val="lowerRoman"/>
+      <w:lvlText w:val="%9."/>
+      <w:lvlJc w:val="right"/>
+      <w:pPr>
+        <w:ind w:left="6120" w:hanging="180"/>
+      </w:pPr>
+    </w:lvl>
+  </w:abstractNum>
   <w:num w:numId="1">
     <w:abstractNumId w:val="5"/>
   </w:num>
@@ -2811,6 +2933,9 @@
   </w:num>
   <w:num w:numId="6">
     <w:abstractNumId w:val="2"/>
+  </w:num>
+  <w:num w:numId="7">
+    <w:abstractNumId w:val="6"/>
   </w:num>
 </w:numbering>
 </file>
@@ -2973,7 +3098,7 @@
   </w:latentStyles>
   <w:style w:type="paragraph" w:default="1" w:styleId="Normal">
     <w:name w:val="Normal"/>
-    <w:rsid w:val="00E57D34"/>
+    <w:rsid w:val="00B842A6"/>
   </w:style>
   <w:style w:type="paragraph" w:styleId="Heading1">
     <w:name w:val="heading 1"/>
@@ -3359,7 +3484,7 @@
   </w:latentStyles>
   <w:style w:type="paragraph" w:default="1" w:styleId="Normal">
     <w:name w:val="Normal"/>
-    <w:rsid w:val="00E57D34"/>
+    <w:rsid w:val="00B842A6"/>
   </w:style>
   <w:style w:type="paragraph" w:styleId="Heading1">
     <w:name w:val="heading 1"/>

</xml_diff>